<commit_message>
Publish approved XBRL GL Next Canonical set
</commit_message>
<xml_diff>
--- a/TaxonomyFramework/XBRL_GL_Next_Taxonomy_Framework_Part_3_OIM_palette_taxonomy.docx
+++ b/TaxonomyFramework/XBRL_GL_Next_Taxonomy_Framework_Part_3_OIM_palette_taxonomy.docx
@@ -145,10 +145,7 @@
           <w:b/>
           <w:bCs/>
         </w:rPr>
-        <w:t>Distribution</w:t>
-      </w:r>
-      <w:r>
-        <w:t>: Private project repository — invited participants only</w:t>
+        <w:t>Distribution: Public collaborative review draft.</w:t>
       </w:r>
     </w:p>
     <w:p>
@@ -157,10 +154,7 @@
           <w:b/>
           <w:bCs/>
         </w:rPr>
-        <w:t>Repository version</w:t>
-      </w:r>
-      <w:r>
-        <w:t>: private collaborative review draft.</w:t>
+        <w:t>Repository version: public collaborative review draft.</w:t>
       </w:r>
     </w:p>
     <w:p>
@@ -191,37 +185,18 @@
       </w:r>
     </w:p>
     <w:p>
-      <w:bookmarkStart w:id="0" w:name="_Toc238901157"/>
       <w:r>
         <w:rPr>
           <w:i/>
         </w:rPr>
-        <w:t>This document is a draft under development by Nobuyuki SAMBUICHI, Advisor to XBRL Japan, for collaborative review within the XBRL GL Next project. It is shared through a GitHub repository with invited project participant</w:t>
-      </w:r>
-      <w:r>
-        <w:rPr>
-          <w:iCs/>
-        </w:rPr>
-        <w:t>s</w:t>
-      </w:r>
-      <w:r>
-        <w:rPr>
-          <w:rFonts w:hint="eastAsia"/>
-          <w:iCs/>
-        </w:rPr>
-        <w:t xml:space="preserve"> </w:t>
-      </w:r>
-      <w:r>
-        <w:rPr>
-          <w:iCs/>
-        </w:rPr>
-        <w:t>.Copyright and license terms under review.</w:t>
+        <w:t>This document is a draft under development by Nobuyuki SAMBUICHI, Advisor to XBRL Japan, for collaborative review within the XBRL GL Next project. It is made available for public collaborative review. Copyright and license terms under review.</w:t>
       </w:r>
     </w:p>
     <w:p>
       <w:pPr>
         <w:pStyle w:val="10"/>
       </w:pPr>
+      <w:bookmarkStart w:id="0" w:name="_Toc244018355"/>
       <w:r>
         <w:t>Status</w:t>
       </w:r>
@@ -236,7 +211,7 @@
       <w:pPr>
         <w:pStyle w:val="10"/>
       </w:pPr>
-      <w:bookmarkStart w:id="1" w:name="_Toc238901158"/>
+      <w:bookmarkStart w:id="1" w:name="_Toc244018356"/>
       <w:r>
         <w:t>Abstract</w:t>
       </w:r>
@@ -273,7 +248,6 @@
           <w:docPartUnique/>
         </w:docPartObj>
       </w:sdtPr>
-      <w:sdtEndPr/>
       <w:sdtContent>
         <w:p>
           <w:pPr>
@@ -309,9 +283,9 @@
               <w:b w:val="0"/>
               <w:noProof/>
               <w:kern w:val="2"/>
-              <w:sz w:val="24"/>
+              <w:sz w:val="21"/>
               <w:szCs w:val="24"/>
-              <w:lang w:eastAsia="ja-JP"/>
+              <w:lang w:val="en-US" w:eastAsia="ja-JP"/>
               <w14:ligatures w14:val="standardContextual"/>
             </w:rPr>
           </w:pPr>
@@ -324,12 +298,11 @@
           <w:r>
             <w:fldChar w:fldCharType="separate"/>
           </w:r>
-          <w:hyperlink w:anchor="_Toc238901157" w:history="1">
+          <w:hyperlink w:anchor="_Toc244018355" w:history="1">
             <w:r>
               <w:rPr>
                 <w:rStyle w:val="af8"/>
                 <w:noProof/>
-                <w:lang w:val="en-GB"/>
               </w:rPr>
               <w:t>Status</w:t>
             </w:r>
@@ -345,13 +318,6 @@
                 <w:noProof/>
                 <w:webHidden/>
               </w:rPr>
-              <w:tab/>
-            </w:r>
-            <w:r>
-              <w:rPr>
-                <w:noProof/>
-                <w:webHidden/>
-              </w:rPr>
               <w:fldChar w:fldCharType="begin"/>
             </w:r>
             <w:r>
@@ -359,7 +325,7 @@
                 <w:noProof/>
                 <w:webHidden/>
               </w:rPr>
-              <w:instrText xml:space="preserve"> PAGEREF _Toc238901157 \h </w:instrText>
+              <w:instrText xml:space="preserve"> PAGEREF _Toc244018355 \h </w:instrText>
             </w:r>
             <w:r>
               <w:rPr>
@@ -398,18 +364,17 @@
               <w:b w:val="0"/>
               <w:noProof/>
               <w:kern w:val="2"/>
-              <w:sz w:val="24"/>
+              <w:sz w:val="21"/>
               <w:szCs w:val="24"/>
-              <w:lang w:eastAsia="ja-JP"/>
+              <w:lang w:val="en-US" w:eastAsia="ja-JP"/>
               <w14:ligatures w14:val="standardContextual"/>
             </w:rPr>
           </w:pPr>
-          <w:hyperlink w:anchor="_Toc238901158" w:history="1">
+          <w:hyperlink w:anchor="_Toc244018356" w:history="1">
             <w:r>
               <w:rPr>
                 <w:rStyle w:val="af8"/>
                 <w:noProof/>
-                <w:lang w:val="en-GB"/>
               </w:rPr>
               <w:t>Abstract</w:t>
             </w:r>
@@ -432,7 +397,7 @@
                 <w:noProof/>
                 <w:webHidden/>
               </w:rPr>
-              <w:instrText xml:space="preserve"> PAGEREF _Toc238901158 \h </w:instrText>
+              <w:instrText xml:space="preserve"> PAGEREF _Toc244018356 \h </w:instrText>
             </w:r>
             <w:r>
               <w:rPr>
@@ -471,18 +436,17 @@
               <w:b w:val="0"/>
               <w:noProof/>
               <w:kern w:val="2"/>
-              <w:sz w:val="24"/>
+              <w:sz w:val="21"/>
               <w:szCs w:val="24"/>
-              <w:lang w:eastAsia="ja-JP"/>
+              <w:lang w:val="en-US" w:eastAsia="ja-JP"/>
               <w14:ligatures w14:val="standardContextual"/>
             </w:rPr>
           </w:pPr>
-          <w:hyperlink w:anchor="_Toc238901159" w:history="1">
+          <w:hyperlink w:anchor="_Toc244018357" w:history="1">
             <w:r>
               <w:rPr>
                 <w:rStyle w:val="af8"/>
                 <w:noProof/>
-                <w:lang w:val="en-GB"/>
               </w:rPr>
               <w:t>1 Language independence</w:t>
             </w:r>
@@ -505,7 +469,7 @@
                 <w:noProof/>
                 <w:webHidden/>
               </w:rPr>
-              <w:instrText xml:space="preserve"> PAGEREF _Toc238901159 \h </w:instrText>
+              <w:instrText xml:space="preserve"> PAGEREF _Toc244018357 \h </w:instrText>
             </w:r>
             <w:r>
               <w:rPr>
@@ -544,18 +508,17 @@
               <w:b w:val="0"/>
               <w:noProof/>
               <w:kern w:val="2"/>
-              <w:sz w:val="24"/>
+              <w:sz w:val="21"/>
               <w:szCs w:val="24"/>
-              <w:lang w:eastAsia="ja-JP"/>
+              <w:lang w:val="en-US" w:eastAsia="ja-JP"/>
               <w14:ligatures w14:val="standardContextual"/>
             </w:rPr>
           </w:pPr>
-          <w:hyperlink w:anchor="_Toc238901160" w:history="1">
+          <w:hyperlink w:anchor="_Toc244018358" w:history="1">
             <w:r>
               <w:rPr>
                 <w:rStyle w:val="af8"/>
                 <w:noProof/>
-                <w:lang w:val="en-GB"/>
               </w:rPr>
               <w:t>2 Introduction</w:t>
             </w:r>
@@ -578,7 +541,7 @@
                 <w:noProof/>
                 <w:webHidden/>
               </w:rPr>
-              <w:instrText xml:space="preserve"> PAGEREF _Toc238901160 \h </w:instrText>
+              <w:instrText xml:space="preserve"> PAGEREF _Toc244018358 \h </w:instrText>
             </w:r>
             <w:r>
               <w:rPr>
@@ -612,24 +575,23 @@
         <w:p>
           <w:pPr>
             <w:pStyle w:val="26"/>
-            <w:ind w:left="1123"/>
+            <w:ind w:leftChars="100" w:left="940" w:rightChars="227" w:right="499"/>
             <w:rPr>
               <w:rFonts w:asciiTheme="minorHAnsi" w:hAnsiTheme="minorHAnsi" w:cstheme="minorBidi"/>
               <w:b w:val="0"/>
               <w:noProof/>
               <w:kern w:val="2"/>
-              <w:sz w:val="24"/>
+              <w:sz w:val="21"/>
               <w:szCs w:val="24"/>
-              <w:lang w:eastAsia="ja-JP"/>
+              <w:lang w:val="en-US" w:eastAsia="ja-JP"/>
               <w14:ligatures w14:val="standardContextual"/>
             </w:rPr>
           </w:pPr>
-          <w:hyperlink w:anchor="_Toc238901161" w:history="1">
+          <w:hyperlink w:anchor="_Toc244018359" w:history="1">
             <w:r>
               <w:rPr>
                 <w:rStyle w:val="af8"/>
                 <w:noProof/>
-                <w:lang w:val="en-GB"/>
               </w:rPr>
               <w:t>2.1 Scope</w:t>
             </w:r>
@@ -652,7 +614,7 @@
                 <w:noProof/>
                 <w:webHidden/>
               </w:rPr>
-              <w:instrText xml:space="preserve"> PAGEREF _Toc238901161 \h </w:instrText>
+              <w:instrText xml:space="preserve"> PAGEREF _Toc244018359 \h </w:instrText>
             </w:r>
             <w:r>
               <w:rPr>
@@ -686,24 +648,23 @@
         <w:p>
           <w:pPr>
             <w:pStyle w:val="26"/>
-            <w:ind w:left="1123"/>
+            <w:ind w:leftChars="100" w:left="940" w:rightChars="227" w:right="499"/>
             <w:rPr>
               <w:rFonts w:asciiTheme="minorHAnsi" w:hAnsiTheme="minorHAnsi" w:cstheme="minorBidi"/>
               <w:b w:val="0"/>
               <w:noProof/>
               <w:kern w:val="2"/>
-              <w:sz w:val="24"/>
+              <w:sz w:val="21"/>
               <w:szCs w:val="24"/>
-              <w:lang w:eastAsia="ja-JP"/>
+              <w:lang w:val="en-US" w:eastAsia="ja-JP"/>
               <w14:ligatures w14:val="standardContextual"/>
             </w:rPr>
           </w:pPr>
-          <w:hyperlink w:anchor="_Toc238901162" w:history="1">
+          <w:hyperlink w:anchor="_Toc244018360" w:history="1">
             <w:r>
               <w:rPr>
                 <w:rStyle w:val="af8"/>
                 <w:noProof/>
-                <w:lang w:val="en-GB"/>
               </w:rPr>
               <w:t>2.2 Normative language</w:t>
             </w:r>
@@ -726,7 +687,7 @@
                 <w:noProof/>
                 <w:webHidden/>
               </w:rPr>
-              <w:instrText xml:space="preserve"> PAGEREF _Toc238901162 \h </w:instrText>
+              <w:instrText xml:space="preserve"> PAGEREF _Toc244018360 \h </w:instrText>
             </w:r>
             <w:r>
               <w:rPr>
@@ -760,24 +721,23 @@
         <w:p>
           <w:pPr>
             <w:pStyle w:val="26"/>
-            <w:ind w:left="1123"/>
+            <w:ind w:leftChars="100" w:left="940" w:rightChars="227" w:right="499"/>
             <w:rPr>
               <w:rFonts w:asciiTheme="minorHAnsi" w:hAnsiTheme="minorHAnsi" w:cstheme="minorBidi"/>
               <w:b w:val="0"/>
               <w:noProof/>
               <w:kern w:val="2"/>
-              <w:sz w:val="24"/>
+              <w:sz w:val="21"/>
               <w:szCs w:val="24"/>
-              <w:lang w:eastAsia="ja-JP"/>
+              <w:lang w:val="en-US" w:eastAsia="ja-JP"/>
               <w14:ligatures w14:val="standardContextual"/>
             </w:rPr>
           </w:pPr>
-          <w:hyperlink w:anchor="_Toc238901163" w:history="1">
+          <w:hyperlink w:anchor="_Toc244018361" w:history="1">
             <w:r>
               <w:rPr>
                 <w:rStyle w:val="af8"/>
                 <w:noProof/>
-                <w:lang w:val="en-GB"/>
               </w:rPr>
               <w:t>2.3 Relationship to the other Parts</w:t>
             </w:r>
@@ -800,7 +760,7 @@
                 <w:noProof/>
                 <w:webHidden/>
               </w:rPr>
-              <w:instrText xml:space="preserve"> PAGEREF _Toc238901163 \h </w:instrText>
+              <w:instrText xml:space="preserve"> PAGEREF _Toc244018361 \h </w:instrText>
             </w:r>
             <w:r>
               <w:rPr>
@@ -834,24 +794,23 @@
         <w:p>
           <w:pPr>
             <w:pStyle w:val="26"/>
-            <w:ind w:left="1123"/>
+            <w:ind w:leftChars="100" w:left="940" w:rightChars="227" w:right="499"/>
             <w:rPr>
               <w:rFonts w:asciiTheme="minorHAnsi" w:hAnsiTheme="minorHAnsi" w:cstheme="minorBidi"/>
               <w:b w:val="0"/>
               <w:noProof/>
               <w:kern w:val="2"/>
-              <w:sz w:val="24"/>
+              <w:sz w:val="21"/>
               <w:szCs w:val="24"/>
-              <w:lang w:eastAsia="ja-JP"/>
+              <w:lang w:val="en-US" w:eastAsia="ja-JP"/>
               <w14:ligatures w14:val="standardContextual"/>
             </w:rPr>
           </w:pPr>
-          <w:hyperlink w:anchor="_Toc238901164" w:history="1">
+          <w:hyperlink w:anchor="_Toc244018362" w:history="1">
             <w:r>
               <w:rPr>
                 <w:rStyle w:val="af8"/>
                 <w:noProof/>
-                <w:lang w:val="en-GB"/>
               </w:rPr>
               <w:t>2.4 Implementation independence</w:t>
             </w:r>
@@ -874,7 +833,7 @@
                 <w:noProof/>
                 <w:webHidden/>
               </w:rPr>
-              <w:instrText xml:space="preserve"> PAGEREF _Toc238901164 \h </w:instrText>
+              <w:instrText xml:space="preserve"> PAGEREF _Toc244018362 \h </w:instrText>
             </w:r>
             <w:r>
               <w:rPr>
@@ -913,18 +872,17 @@
               <w:b w:val="0"/>
               <w:noProof/>
               <w:kern w:val="2"/>
-              <w:sz w:val="24"/>
+              <w:sz w:val="21"/>
               <w:szCs w:val="24"/>
-              <w:lang w:eastAsia="ja-JP"/>
+              <w:lang w:val="en-US" w:eastAsia="ja-JP"/>
               <w14:ligatures w14:val="standardContextual"/>
             </w:rPr>
           </w:pPr>
-          <w:hyperlink w:anchor="_Toc238901165" w:history="1">
+          <w:hyperlink w:anchor="_Toc244018363" w:history="1">
             <w:r>
               <w:rPr>
                 <w:rStyle w:val="af8"/>
                 <w:noProof/>
-                <w:lang w:val="en-GB"/>
               </w:rPr>
               <w:t>3 Terms and definitions</w:t>
             </w:r>
@@ -947,7 +905,7 @@
                 <w:noProof/>
                 <w:webHidden/>
               </w:rPr>
-              <w:instrText xml:space="preserve"> PAGEREF _Toc238901165 \h </w:instrText>
+              <w:instrText xml:space="preserve"> PAGEREF _Toc244018363 \h </w:instrText>
             </w:r>
             <w:r>
               <w:rPr>
@@ -967,7 +925,7 @@
                 <w:noProof/>
                 <w:webHidden/>
               </w:rPr>
-              <w:t>4</w:t>
+              <w:t>5</w:t>
             </w:r>
             <w:r>
               <w:rPr>
@@ -986,18 +944,17 @@
               <w:b w:val="0"/>
               <w:noProof/>
               <w:kern w:val="2"/>
-              <w:sz w:val="24"/>
+              <w:sz w:val="21"/>
               <w:szCs w:val="24"/>
-              <w:lang w:eastAsia="ja-JP"/>
+              <w:lang w:val="en-US" w:eastAsia="ja-JP"/>
               <w14:ligatures w14:val="standardContextual"/>
             </w:rPr>
           </w:pPr>
-          <w:hyperlink w:anchor="_Toc238901166" w:history="1">
+          <w:hyperlink w:anchor="_Toc244018364" w:history="1">
             <w:r>
               <w:rPr>
                 <w:rStyle w:val="af8"/>
                 <w:noProof/>
-                <w:lang w:val="en-GB"/>
               </w:rPr>
               <w:t>4 Authoritative input and validation contract</w:t>
             </w:r>
@@ -1020,7 +977,7 @@
                 <w:noProof/>
                 <w:webHidden/>
               </w:rPr>
-              <w:instrText xml:space="preserve"> PAGEREF _Toc238901166 \h </w:instrText>
+              <w:instrText xml:space="preserve"> PAGEREF _Toc244018364 \h </w:instrText>
             </w:r>
             <w:r>
               <w:rPr>
@@ -1054,24 +1011,23 @@
         <w:p>
           <w:pPr>
             <w:pStyle w:val="26"/>
-            <w:ind w:left="1123"/>
+            <w:ind w:leftChars="100" w:left="940" w:rightChars="227" w:right="499"/>
             <w:rPr>
               <w:rFonts w:asciiTheme="minorHAnsi" w:hAnsiTheme="minorHAnsi" w:cstheme="minorBidi"/>
               <w:b w:val="0"/>
               <w:noProof/>
               <w:kern w:val="2"/>
-              <w:sz w:val="24"/>
+              <w:sz w:val="21"/>
               <w:szCs w:val="24"/>
-              <w:lang w:eastAsia="ja-JP"/>
+              <w:lang w:val="en-US" w:eastAsia="ja-JP"/>
               <w14:ligatures w14:val="standardContextual"/>
             </w:rPr>
           </w:pPr>
-          <w:hyperlink w:anchor="_Toc238901167" w:history="1">
+          <w:hyperlink w:anchor="_Toc244018365" w:history="1">
             <w:r>
               <w:rPr>
                 <w:rStyle w:val="af8"/>
                 <w:noProof/>
-                <w:lang w:val="en-GB"/>
               </w:rPr>
               <w:t>4.1 Input authority</w:t>
             </w:r>
@@ -1094,7 +1050,7 @@
                 <w:noProof/>
                 <w:webHidden/>
               </w:rPr>
-              <w:instrText xml:space="preserve"> PAGEREF _Toc238901167 \h </w:instrText>
+              <w:instrText xml:space="preserve"> PAGEREF _Toc244018365 \h </w:instrText>
             </w:r>
             <w:r>
               <w:rPr>
@@ -1128,24 +1084,23 @@
         <w:p>
           <w:pPr>
             <w:pStyle w:val="26"/>
-            <w:ind w:left="1123"/>
+            <w:ind w:leftChars="100" w:left="940" w:rightChars="227" w:right="499"/>
             <w:rPr>
               <w:rFonts w:asciiTheme="minorHAnsi" w:hAnsiTheme="minorHAnsi" w:cstheme="minorBidi"/>
               <w:b w:val="0"/>
               <w:noProof/>
               <w:kern w:val="2"/>
-              <w:sz w:val="24"/>
+              <w:sz w:val="21"/>
               <w:szCs w:val="24"/>
-              <w:lang w:eastAsia="ja-JP"/>
+              <w:lang w:val="en-US" w:eastAsia="ja-JP"/>
               <w14:ligatures w14:val="standardContextual"/>
             </w:rPr>
           </w:pPr>
-          <w:hyperlink w:anchor="_Toc238901168" w:history="1">
+          <w:hyperlink w:anchor="_Toc244018366" w:history="1">
             <w:r>
               <w:rPr>
                 <w:rStyle w:val="af8"/>
                 <w:noProof/>
-                <w:lang w:val="en-GB"/>
               </w:rPr>
               <w:t>4.2 Required 18-column order</w:t>
             </w:r>
@@ -1168,7 +1123,7 @@
                 <w:noProof/>
                 <w:webHidden/>
               </w:rPr>
-              <w:instrText xml:space="preserve"> PAGEREF _Toc238901168 \h </w:instrText>
+              <w:instrText xml:space="preserve"> PAGEREF _Toc244018366 \h </w:instrText>
             </w:r>
             <w:r>
               <w:rPr>
@@ -1202,24 +1157,23 @@
         <w:p>
           <w:pPr>
             <w:pStyle w:val="26"/>
-            <w:ind w:left="1123"/>
+            <w:ind w:leftChars="100" w:left="940" w:rightChars="227" w:right="499"/>
             <w:rPr>
               <w:rFonts w:asciiTheme="minorHAnsi" w:hAnsiTheme="minorHAnsi" w:cstheme="minorBidi"/>
               <w:b w:val="0"/>
               <w:noProof/>
               <w:kern w:val="2"/>
-              <w:sz w:val="24"/>
+              <w:sz w:val="21"/>
               <w:szCs w:val="24"/>
-              <w:lang w:eastAsia="ja-JP"/>
+              <w:lang w:val="en-US" w:eastAsia="ja-JP"/>
               <w14:ligatures w14:val="standardContextual"/>
             </w:rPr>
           </w:pPr>
-          <w:hyperlink w:anchor="_Toc238901169" w:history="1">
+          <w:hyperlink w:anchor="_Toc244018367" w:history="1">
             <w:r>
               <w:rPr>
                 <w:rStyle w:val="af8"/>
                 <w:noProof/>
-                <w:lang w:val="en-GB"/>
               </w:rPr>
               <w:t>4.3 XPath and QName authority</w:t>
             </w:r>
@@ -1242,7 +1196,7 @@
                 <w:noProof/>
                 <w:webHidden/>
               </w:rPr>
-              <w:instrText xml:space="preserve"> PAGEREF _Toc238901169 \h </w:instrText>
+              <w:instrText xml:space="preserve"> PAGEREF _Toc244018367 \h </w:instrText>
             </w:r>
             <w:r>
               <w:rPr>
@@ -1276,24 +1230,23 @@
         <w:p>
           <w:pPr>
             <w:pStyle w:val="26"/>
-            <w:ind w:left="1123"/>
+            <w:ind w:leftChars="100" w:left="940" w:rightChars="227" w:right="499"/>
             <w:rPr>
               <w:rFonts w:asciiTheme="minorHAnsi" w:hAnsiTheme="minorHAnsi" w:cstheme="minorBidi"/>
               <w:b w:val="0"/>
               <w:noProof/>
               <w:kern w:val="2"/>
-              <w:sz w:val="24"/>
+              <w:sz w:val="21"/>
               <w:szCs w:val="24"/>
-              <w:lang w:eastAsia="ja-JP"/>
+              <w:lang w:val="en-US" w:eastAsia="ja-JP"/>
               <w14:ligatures w14:val="standardContextual"/>
             </w:rPr>
           </w:pPr>
-          <w:hyperlink w:anchor="_Toc238901170" w:history="1">
+          <w:hyperlink w:anchor="_Toc244018368" w:history="1">
             <w:r>
               <w:rPr>
                 <w:rStyle w:val="af8"/>
                 <w:noProof/>
-                <w:lang w:val="en-GB"/>
               </w:rPr>
               <w:t>4.4 Row validation</w:t>
             </w:r>
@@ -1316,7 +1269,7 @@
                 <w:noProof/>
                 <w:webHidden/>
               </w:rPr>
-              <w:instrText xml:space="preserve"> PAGEREF _Toc238901170 \h </w:instrText>
+              <w:instrText xml:space="preserve"> PAGEREF _Toc244018368 \h </w:instrText>
             </w:r>
             <w:r>
               <w:rPr>
@@ -1336,7 +1289,7 @@
                 <w:noProof/>
                 <w:webHidden/>
               </w:rPr>
-              <w:t>6</w:t>
+              <w:t>7</w:t>
             </w:r>
             <w:r>
               <w:rPr>
@@ -1350,24 +1303,23 @@
         <w:p>
           <w:pPr>
             <w:pStyle w:val="26"/>
-            <w:ind w:left="1123"/>
+            <w:ind w:leftChars="100" w:left="940" w:rightChars="227" w:right="499"/>
             <w:rPr>
               <w:rFonts w:asciiTheme="minorHAnsi" w:hAnsiTheme="minorHAnsi" w:cstheme="minorBidi"/>
               <w:b w:val="0"/>
               <w:noProof/>
               <w:kern w:val="2"/>
-              <w:sz w:val="24"/>
+              <w:sz w:val="21"/>
               <w:szCs w:val="24"/>
-              <w:lang w:eastAsia="ja-JP"/>
+              <w:lang w:val="en-US" w:eastAsia="ja-JP"/>
               <w14:ligatures w14:val="standardContextual"/>
             </w:rPr>
           </w:pPr>
-          <w:hyperlink w:anchor="_Toc238901171" w:history="1">
+          <w:hyperlink w:anchor="_Toc244018369" w:history="1">
             <w:r>
               <w:rPr>
                 <w:rStyle w:val="af8"/>
                 <w:noProof/>
-                <w:lang w:val="en-GB"/>
               </w:rPr>
               <w:t>4.5 Non-use subtrees</w:t>
             </w:r>
@@ -1390,7 +1342,7 @@
                 <w:noProof/>
                 <w:webHidden/>
               </w:rPr>
-              <w:instrText xml:space="preserve"> PAGEREF _Toc238901171 \h </w:instrText>
+              <w:instrText xml:space="preserve"> PAGEREF _Toc244018369 \h </w:instrText>
             </w:r>
             <w:r>
               <w:rPr>
@@ -1424,24 +1376,23 @@
         <w:p>
           <w:pPr>
             <w:pStyle w:val="26"/>
-            <w:ind w:left="1123"/>
+            <w:ind w:leftChars="100" w:left="940" w:rightChars="227" w:right="499"/>
             <w:rPr>
               <w:rFonts w:asciiTheme="minorHAnsi" w:hAnsiTheme="minorHAnsi" w:cstheme="minorBidi"/>
               <w:b w:val="0"/>
               <w:noProof/>
               <w:kern w:val="2"/>
-              <w:sz w:val="24"/>
+              <w:sz w:val="21"/>
               <w:szCs w:val="24"/>
-              <w:lang w:eastAsia="ja-JP"/>
+              <w:lang w:val="en-US" w:eastAsia="ja-JP"/>
               <w14:ligatures w14:val="standardContextual"/>
             </w:rPr>
           </w:pPr>
-          <w:hyperlink w:anchor="_Toc238901172" w:history="1">
+          <w:hyperlink w:anchor="_Toc244018370" w:history="1">
             <w:r>
               <w:rPr>
                 <w:rStyle w:val="af8"/>
                 <w:noProof/>
-                <w:lang w:val="en-GB"/>
               </w:rPr>
               <w:t>4.6 Cross-HMD shared declarations</w:t>
             </w:r>
@@ -1464,7 +1415,7 @@
                 <w:noProof/>
                 <w:webHidden/>
               </w:rPr>
-              <w:instrText xml:space="preserve"> PAGEREF _Toc238901172 \h </w:instrText>
+              <w:instrText xml:space="preserve"> PAGEREF _Toc244018370 \h </w:instrText>
             </w:r>
             <w:r>
               <w:rPr>
@@ -1503,18 +1454,17 @@
               <w:b w:val="0"/>
               <w:noProof/>
               <w:kern w:val="2"/>
-              <w:sz w:val="24"/>
+              <w:sz w:val="21"/>
               <w:szCs w:val="24"/>
-              <w:lang w:eastAsia="ja-JP"/>
+              <w:lang w:val="en-US" w:eastAsia="ja-JP"/>
               <w14:ligatures w14:val="standardContextual"/>
             </w:rPr>
           </w:pPr>
-          <w:hyperlink w:anchor="_Toc238901173" w:history="1">
+          <w:hyperlink w:anchor="_Toc244018371" w:history="1">
             <w:r>
               <w:rPr>
                 <w:rStyle w:val="af8"/>
                 <w:noProof/>
-                <w:lang w:val="en-GB"/>
               </w:rPr>
               <w:t>5 OIM binding model</w:t>
             </w:r>
@@ -1537,7 +1487,7 @@
                 <w:noProof/>
                 <w:webHidden/>
               </w:rPr>
-              <w:instrText xml:space="preserve"> PAGEREF _Toc238901173 \h </w:instrText>
+              <w:instrText xml:space="preserve"> PAGEREF _Toc244018371 \h </w:instrText>
             </w:r>
             <w:r>
               <w:rPr>
@@ -1571,24 +1521,23 @@
         <w:p>
           <w:pPr>
             <w:pStyle w:val="26"/>
-            <w:ind w:left="1123"/>
+            <w:ind w:leftChars="100" w:left="940" w:rightChars="227" w:right="499"/>
             <w:rPr>
               <w:rFonts w:asciiTheme="minorHAnsi" w:hAnsiTheme="minorHAnsi" w:cstheme="minorBidi"/>
               <w:b w:val="0"/>
               <w:noProof/>
               <w:kern w:val="2"/>
-              <w:sz w:val="24"/>
+              <w:sz w:val="21"/>
               <w:szCs w:val="24"/>
-              <w:lang w:eastAsia="ja-JP"/>
+              <w:lang w:val="en-US" w:eastAsia="ja-JP"/>
               <w14:ligatures w14:val="standardContextual"/>
             </w:rPr>
           </w:pPr>
-          <w:hyperlink w:anchor="_Toc238901174" w:history="1">
+          <w:hyperlink w:anchor="_Toc244018372" w:history="1">
             <w:r>
               <w:rPr>
                 <w:rStyle w:val="af8"/>
                 <w:noProof/>
-                <w:lang w:val="en-GB"/>
               </w:rPr>
               <w:t>5.1 Attribute facts</w:t>
             </w:r>
@@ -1611,7 +1560,7 @@
                 <w:noProof/>
                 <w:webHidden/>
               </w:rPr>
-              <w:instrText xml:space="preserve"> PAGEREF _Toc238901174 \h </w:instrText>
+              <w:instrText xml:space="preserve"> PAGEREF _Toc244018372 \h </w:instrText>
             </w:r>
             <w:r>
               <w:rPr>
@@ -1645,24 +1594,23 @@
         <w:p>
           <w:pPr>
             <w:pStyle w:val="26"/>
-            <w:ind w:left="1123"/>
+            <w:ind w:leftChars="100" w:left="940" w:rightChars="227" w:right="499"/>
             <w:rPr>
               <w:rFonts w:asciiTheme="minorHAnsi" w:hAnsiTheme="minorHAnsi" w:cstheme="minorBidi"/>
               <w:b w:val="0"/>
               <w:noProof/>
               <w:kern w:val="2"/>
-              <w:sz w:val="24"/>
+              <w:sz w:val="21"/>
               <w:szCs w:val="24"/>
-              <w:lang w:eastAsia="ja-JP"/>
+              <w:lang w:val="en-US" w:eastAsia="ja-JP"/>
               <w14:ligatures w14:val="standardContextual"/>
             </w:rPr>
           </w:pPr>
-          <w:hyperlink w:anchor="_Toc238901175" w:history="1">
+          <w:hyperlink w:anchor="_Toc244018373" w:history="1">
             <w:r>
               <w:rPr>
                 <w:rStyle w:val="af8"/>
                 <w:noProof/>
-                <w:lang w:val="en-GB"/>
               </w:rPr>
               <w:t>5.2 Structural rows</w:t>
             </w:r>
@@ -1685,7 +1633,7 @@
                 <w:noProof/>
                 <w:webHidden/>
               </w:rPr>
-              <w:instrText xml:space="preserve"> PAGEREF _Toc238901175 \h </w:instrText>
+              <w:instrText xml:space="preserve"> PAGEREF _Toc244018373 \h </w:instrText>
             </w:r>
             <w:r>
               <w:rPr>
@@ -1705,7 +1653,7 @@
                 <w:noProof/>
                 <w:webHidden/>
               </w:rPr>
-              <w:t>7</w:t>
+              <w:t>8</w:t>
             </w:r>
             <w:r>
               <w:rPr>
@@ -1719,24 +1667,23 @@
         <w:p>
           <w:pPr>
             <w:pStyle w:val="26"/>
-            <w:ind w:left="1123"/>
+            <w:ind w:leftChars="100" w:left="940" w:rightChars="227" w:right="499"/>
             <w:rPr>
               <w:rFonts w:asciiTheme="minorHAnsi" w:hAnsiTheme="minorHAnsi" w:cstheme="minorBidi"/>
               <w:b w:val="0"/>
               <w:noProof/>
               <w:kern w:val="2"/>
-              <w:sz w:val="24"/>
+              <w:sz w:val="21"/>
               <w:szCs w:val="24"/>
-              <w:lang w:eastAsia="ja-JP"/>
+              <w:lang w:val="en-US" w:eastAsia="ja-JP"/>
               <w14:ligatures w14:val="standardContextual"/>
             </w:rPr>
           </w:pPr>
-          <w:hyperlink w:anchor="_Toc238901176" w:history="1">
+          <w:hyperlink w:anchor="_Toc244018374" w:history="1">
             <w:r>
               <w:rPr>
                 <w:rStyle w:val="af8"/>
                 <w:noProof/>
-                <w:lang w:val="en-GB"/>
               </w:rPr>
               <w:t>5.3 Class resources</w:t>
             </w:r>
@@ -1759,7 +1706,7 @@
                 <w:noProof/>
                 <w:webHidden/>
               </w:rPr>
-              <w:instrText xml:space="preserve"> PAGEREF _Toc238901176 \h </w:instrText>
+              <w:instrText xml:space="preserve"> PAGEREF _Toc244018374 \h </w:instrText>
             </w:r>
             <w:r>
               <w:rPr>
@@ -1779,7 +1726,7 @@
                 <w:noProof/>
                 <w:webHidden/>
               </w:rPr>
-              <w:t>7</w:t>
+              <w:t>8</w:t>
             </w:r>
             <w:r>
               <w:rPr>
@@ -1793,24 +1740,23 @@
         <w:p>
           <w:pPr>
             <w:pStyle w:val="26"/>
-            <w:ind w:left="1123"/>
+            <w:ind w:leftChars="100" w:left="940" w:rightChars="227" w:right="499"/>
             <w:rPr>
               <w:rFonts w:asciiTheme="minorHAnsi" w:hAnsiTheme="minorHAnsi" w:cstheme="minorBidi"/>
               <w:b w:val="0"/>
               <w:noProof/>
               <w:kern w:val="2"/>
-              <w:sz w:val="24"/>
+              <w:sz w:val="21"/>
               <w:szCs w:val="24"/>
-              <w:lang w:eastAsia="ja-JP"/>
+              <w:lang w:val="en-US" w:eastAsia="ja-JP"/>
               <w14:ligatures w14:val="standardContextual"/>
             </w:rPr>
           </w:pPr>
-          <w:hyperlink w:anchor="_Toc238901177" w:history="1">
+          <w:hyperlink w:anchor="_Toc244018375" w:history="1">
             <w:r>
               <w:rPr>
                 <w:rStyle w:val="af8"/>
                 <w:noProof/>
-                <w:lang w:val="en-GB"/>
               </w:rPr>
               <w:t>5.4 Extended roles</w:t>
             </w:r>
@@ -1833,7 +1779,7 @@
                 <w:noProof/>
                 <w:webHidden/>
               </w:rPr>
-              <w:instrText xml:space="preserve"> PAGEREF _Toc238901177 \h </w:instrText>
+              <w:instrText xml:space="preserve"> PAGEREF _Toc244018375 \h </w:instrText>
             </w:r>
             <w:r>
               <w:rPr>
@@ -1872,18 +1818,17 @@
               <w:b w:val="0"/>
               <w:noProof/>
               <w:kern w:val="2"/>
-              <w:sz w:val="24"/>
+              <w:sz w:val="21"/>
               <w:szCs w:val="24"/>
-              <w:lang w:eastAsia="ja-JP"/>
+              <w:lang w:val="en-US" w:eastAsia="ja-JP"/>
               <w14:ligatures w14:val="standardContextual"/>
             </w:rPr>
           </w:pPr>
-          <w:hyperlink w:anchor="_Toc238901178" w:history="1">
+          <w:hyperlink w:anchor="_Toc244018376" w:history="1">
             <w:r>
               <w:rPr>
                 <w:rStyle w:val="af8"/>
                 <w:noProof/>
-                <w:lang w:val="en-GB"/>
               </w:rPr>
               <w:t>6 Dimensional network generation</w:t>
             </w:r>
@@ -1906,7 +1851,7 @@
                 <w:noProof/>
                 <w:webHidden/>
               </w:rPr>
-              <w:instrText xml:space="preserve"> PAGEREF _Toc238901178 \h </w:instrText>
+              <w:instrText xml:space="preserve"> PAGEREF _Toc244018376 \h </w:instrText>
             </w:r>
             <w:r>
               <w:rPr>
@@ -1940,24 +1885,23 @@
         <w:p>
           <w:pPr>
             <w:pStyle w:val="26"/>
-            <w:ind w:left="1123"/>
+            <w:ind w:leftChars="100" w:left="940" w:rightChars="227" w:right="499"/>
             <w:rPr>
               <w:rFonts w:asciiTheme="minorHAnsi" w:hAnsiTheme="minorHAnsi" w:cstheme="minorBidi"/>
               <w:b w:val="0"/>
               <w:noProof/>
               <w:kern w:val="2"/>
-              <w:sz w:val="24"/>
+              <w:sz w:val="21"/>
               <w:szCs w:val="24"/>
-              <w:lang w:eastAsia="ja-JP"/>
+              <w:lang w:val="en-US" w:eastAsia="ja-JP"/>
               <w14:ligatures w14:val="standardContextual"/>
             </w:rPr>
           </w:pPr>
-          <w:hyperlink w:anchor="_Toc238901179" w:history="1">
+          <w:hyperlink w:anchor="_Toc244018377" w:history="1">
             <w:r>
               <w:rPr>
                 <w:rStyle w:val="af8"/>
                 <w:noProof/>
-                <w:lang w:val="en-GB"/>
               </w:rPr>
               <w:t>6.1 Closed cube</w:t>
             </w:r>
@@ -1980,7 +1924,7 @@
                 <w:noProof/>
                 <w:webHidden/>
               </w:rPr>
-              <w:instrText xml:space="preserve"> PAGEREF _Toc238901179 \h </w:instrText>
+              <w:instrText xml:space="preserve"> PAGEREF _Toc244018377 \h </w:instrText>
             </w:r>
             <w:r>
               <w:rPr>
@@ -2014,24 +1958,23 @@
         <w:p>
           <w:pPr>
             <w:pStyle w:val="26"/>
-            <w:ind w:left="1123"/>
+            <w:ind w:leftChars="100" w:left="940" w:rightChars="227" w:right="499"/>
             <w:rPr>
               <w:rFonts w:asciiTheme="minorHAnsi" w:hAnsiTheme="minorHAnsi" w:cstheme="minorBidi"/>
               <w:b w:val="0"/>
               <w:noProof/>
               <w:kern w:val="2"/>
-              <w:sz w:val="24"/>
+              <w:sz w:val="21"/>
               <w:szCs w:val="24"/>
-              <w:lang w:eastAsia="ja-JP"/>
+              <w:lang w:val="en-US" w:eastAsia="ja-JP"/>
               <w14:ligatures w14:val="standardContextual"/>
             </w:rPr>
           </w:pPr>
-          <w:hyperlink w:anchor="_Toc238901180" w:history="1">
+          <w:hyperlink w:anchor="_Toc244018378" w:history="1">
             <w:r>
               <w:rPr>
                 <w:rStyle w:val="af8"/>
                 <w:noProof/>
-                <w:lang w:val="en-GB"/>
               </w:rPr>
               <w:t>6.2 Occurrence dimensions</w:t>
             </w:r>
@@ -2054,7 +1997,7 @@
                 <w:noProof/>
                 <w:webHidden/>
               </w:rPr>
-              <w:instrText xml:space="preserve"> PAGEREF _Toc238901180 \h </w:instrText>
+              <w:instrText xml:space="preserve"> PAGEREF _Toc244018378 \h </w:instrText>
             </w:r>
             <w:r>
               <w:rPr>
@@ -2088,24 +2031,23 @@
         <w:p>
           <w:pPr>
             <w:pStyle w:val="26"/>
-            <w:ind w:left="1123"/>
+            <w:ind w:leftChars="100" w:left="940" w:rightChars="227" w:right="499"/>
             <w:rPr>
               <w:rFonts w:asciiTheme="minorHAnsi" w:hAnsiTheme="minorHAnsi" w:cstheme="minorBidi"/>
               <w:b w:val="0"/>
               <w:noProof/>
               <w:kern w:val="2"/>
-              <w:sz w:val="24"/>
+              <w:sz w:val="21"/>
               <w:szCs w:val="24"/>
-              <w:lang w:eastAsia="ja-JP"/>
+              <w:lang w:val="en-US" w:eastAsia="ja-JP"/>
               <w14:ligatures w14:val="standardContextual"/>
             </w:rPr>
           </w:pPr>
-          <w:hyperlink w:anchor="_Toc238901181" w:history="1">
+          <w:hyperlink w:anchor="_Toc244018379" w:history="1">
             <w:r>
               <w:rPr>
                 <w:rStyle w:val="af8"/>
                 <w:noProof/>
-                <w:lang w:val="en-GB"/>
               </w:rPr>
               <w:t>6.3 Attribute membership</w:t>
             </w:r>
@@ -2128,7 +2070,7 @@
                 <w:noProof/>
                 <w:webHidden/>
               </w:rPr>
-              <w:instrText xml:space="preserve"> PAGEREF _Toc238901181 \h </w:instrText>
+              <w:instrText xml:space="preserve"> PAGEREF _Toc244018379 \h </w:instrText>
             </w:r>
             <w:r>
               <w:rPr>
@@ -2148,7 +2090,7 @@
                 <w:noProof/>
                 <w:webHidden/>
               </w:rPr>
-              <w:t>8</w:t>
+              <w:t>9</w:t>
             </w:r>
             <w:r>
               <w:rPr>
@@ -2162,24 +2104,23 @@
         <w:p>
           <w:pPr>
             <w:pStyle w:val="26"/>
-            <w:ind w:left="1123"/>
+            <w:ind w:leftChars="100" w:left="940" w:rightChars="227" w:right="499"/>
             <w:rPr>
               <w:rFonts w:asciiTheme="minorHAnsi" w:hAnsiTheme="minorHAnsi" w:cstheme="minorBidi"/>
               <w:b w:val="0"/>
               <w:noProof/>
               <w:kern w:val="2"/>
-              <w:sz w:val="24"/>
+              <w:sz w:val="21"/>
               <w:szCs w:val="24"/>
-              <w:lang w:eastAsia="ja-JP"/>
+              <w:lang w:val="en-US" w:eastAsia="ja-JP"/>
               <w14:ligatures w14:val="standardContextual"/>
             </w:rPr>
           </w:pPr>
-          <w:hyperlink w:anchor="_Toc238901182" w:history="1">
+          <w:hyperlink w:anchor="_Toc244018380" w:history="1">
             <w:r>
               <w:rPr>
                 <w:rStyle w:val="af8"/>
                 <w:noProof/>
-                <w:lang w:val="en-GB"/>
               </w:rPr>
               <w:t>6.4 Descendant Classes and targetRole</w:t>
             </w:r>
@@ -2202,7 +2143,7 @@
                 <w:noProof/>
                 <w:webHidden/>
               </w:rPr>
-              <w:instrText xml:space="preserve"> PAGEREF _Toc238901182 \h </w:instrText>
+              <w:instrText xml:space="preserve"> PAGEREF _Toc244018380 \h </w:instrText>
             </w:r>
             <w:r>
               <w:rPr>
@@ -2222,7 +2163,7 @@
                 <w:noProof/>
                 <w:webHidden/>
               </w:rPr>
-              <w:t>8</w:t>
+              <w:t>9</w:t>
             </w:r>
             <w:r>
               <w:rPr>
@@ -2236,24 +2177,23 @@
         <w:p>
           <w:pPr>
             <w:pStyle w:val="26"/>
-            <w:ind w:left="1123"/>
+            <w:ind w:leftChars="100" w:left="940" w:rightChars="227" w:right="499"/>
             <w:rPr>
               <w:rFonts w:asciiTheme="minorHAnsi" w:hAnsiTheme="minorHAnsi" w:cstheme="minorBidi"/>
               <w:b w:val="0"/>
               <w:noProof/>
               <w:kern w:val="2"/>
-              <w:sz w:val="24"/>
+              <w:sz w:val="21"/>
               <w:szCs w:val="24"/>
-              <w:lang w:eastAsia="ja-JP"/>
+              <w:lang w:val="en-US" w:eastAsia="ja-JP"/>
               <w14:ligatures w14:val="standardContextual"/>
             </w:rPr>
           </w:pPr>
-          <w:hyperlink w:anchor="_Toc238901183" w:history="1">
+          <w:hyperlink w:anchor="_Toc244018381" w:history="1">
             <w:r>
               <w:rPr>
                 <w:rStyle w:val="af8"/>
                 <w:noProof/>
-                <w:lang w:val="en-GB"/>
               </w:rPr>
               <w:t>6.5 Reading the dimensional hierarchy</w:t>
             </w:r>
@@ -2276,7 +2216,7 @@
                 <w:noProof/>
                 <w:webHidden/>
               </w:rPr>
-              <w:instrText xml:space="preserve"> PAGEREF _Toc238901183 \h </w:instrText>
+              <w:instrText xml:space="preserve"> PAGEREF _Toc244018381 \h </w:instrText>
             </w:r>
             <w:r>
               <w:rPr>
@@ -2296,7 +2236,7 @@
                 <w:noProof/>
                 <w:webHidden/>
               </w:rPr>
-              <w:t>8</w:t>
+              <w:t>9</w:t>
             </w:r>
             <w:r>
               <w:rPr>
@@ -2310,24 +2250,23 @@
         <w:p>
           <w:pPr>
             <w:pStyle w:val="26"/>
-            <w:ind w:left="1123"/>
+            <w:ind w:leftChars="100" w:left="940" w:rightChars="227" w:right="499"/>
             <w:rPr>
               <w:rFonts w:asciiTheme="minorHAnsi" w:hAnsiTheme="minorHAnsi" w:cstheme="minorBidi"/>
               <w:b w:val="0"/>
               <w:noProof/>
               <w:kern w:val="2"/>
-              <w:sz w:val="24"/>
+              <w:sz w:val="21"/>
               <w:szCs w:val="24"/>
-              <w:lang w:eastAsia="ja-JP"/>
+              <w:lang w:val="en-US" w:eastAsia="ja-JP"/>
               <w14:ligatures w14:val="standardContextual"/>
             </w:rPr>
           </w:pPr>
-          <w:hyperlink w:anchor="_Toc238901184" w:history="1">
+          <w:hyperlink w:anchor="_Toc244018382" w:history="1">
             <w:r>
               <w:rPr>
                 <w:rStyle w:val="af8"/>
                 <w:noProof/>
-                <w:lang w:val="en-GB"/>
               </w:rPr>
               <w:t>6.6 Multiplicity</w:t>
             </w:r>
@@ -2350,7 +2289,7 @@
                 <w:noProof/>
                 <w:webHidden/>
               </w:rPr>
-              <w:instrText xml:space="preserve"> PAGEREF _Toc238901184 \h </w:instrText>
+              <w:instrText xml:space="preserve"> PAGEREF _Toc244018382 \h </w:instrText>
             </w:r>
             <w:r>
               <w:rPr>
@@ -2384,24 +2323,23 @@
         <w:p>
           <w:pPr>
             <w:pStyle w:val="26"/>
-            <w:ind w:left="1123"/>
+            <w:ind w:leftChars="100" w:left="940" w:rightChars="227" w:right="499"/>
             <w:rPr>
               <w:rFonts w:asciiTheme="minorHAnsi" w:hAnsiTheme="minorHAnsi" w:cstheme="minorBidi"/>
               <w:b w:val="0"/>
               <w:noProof/>
               <w:kern w:val="2"/>
-              <w:sz w:val="24"/>
+              <w:sz w:val="21"/>
               <w:szCs w:val="24"/>
-              <w:lang w:eastAsia="ja-JP"/>
+              <w:lang w:val="en-US" w:eastAsia="ja-JP"/>
               <w14:ligatures w14:val="standardContextual"/>
             </w:rPr>
           </w:pPr>
-          <w:hyperlink w:anchor="_Toc238901185" w:history="1">
+          <w:hyperlink w:anchor="_Toc244018383" w:history="1">
             <w:r>
               <w:rPr>
                 <w:rStyle w:val="af8"/>
                 <w:noProof/>
-                <w:lang w:val="en-GB"/>
               </w:rPr>
               <w:t>6.7 Occurrence-key alignment example</w:t>
             </w:r>
@@ -2424,7 +2362,7 @@
                 <w:noProof/>
                 <w:webHidden/>
               </w:rPr>
-              <w:instrText xml:space="preserve"> PAGEREF _Toc238901185 \h </w:instrText>
+              <w:instrText xml:space="preserve"> PAGEREF _Toc244018383 \h </w:instrText>
             </w:r>
             <w:r>
               <w:rPr>
@@ -2463,18 +2401,17 @@
               <w:b w:val="0"/>
               <w:noProof/>
               <w:kern w:val="2"/>
-              <w:sz w:val="24"/>
+              <w:sz w:val="21"/>
               <w:szCs w:val="24"/>
-              <w:lang w:eastAsia="ja-JP"/>
+              <w:lang w:val="en-US" w:eastAsia="ja-JP"/>
               <w14:ligatures w14:val="standardContextual"/>
             </w:rPr>
           </w:pPr>
-          <w:hyperlink w:anchor="_Toc238901186" w:history="1">
+          <w:hyperlink w:anchor="_Toc244018384" w:history="1">
             <w:r>
               <w:rPr>
                 <w:rStyle w:val="af8"/>
                 <w:noProof/>
-                <w:lang w:val="en-GB"/>
               </w:rPr>
               <w:t>7 OIM taxonomy artefacts</w:t>
             </w:r>
@@ -2497,7 +2434,7 @@
                 <w:noProof/>
                 <w:webHidden/>
               </w:rPr>
-              <w:instrText xml:space="preserve"> PAGEREF _Toc238901186 \h </w:instrText>
+              <w:instrText xml:space="preserve"> PAGEREF _Toc244018384 \h </w:instrText>
             </w:r>
             <w:r>
               <w:rPr>
@@ -2517,7 +2454,7 @@
                 <w:noProof/>
                 <w:webHidden/>
               </w:rPr>
-              <w:t>9</w:t>
+              <w:t>10</w:t>
             </w:r>
             <w:r>
               <w:rPr>
@@ -2531,24 +2468,23 @@
         <w:p>
           <w:pPr>
             <w:pStyle w:val="26"/>
-            <w:ind w:left="1123"/>
+            <w:ind w:leftChars="100" w:left="940" w:rightChars="227" w:right="499"/>
             <w:rPr>
               <w:rFonts w:asciiTheme="minorHAnsi" w:hAnsiTheme="minorHAnsi" w:cstheme="minorBidi"/>
               <w:b w:val="0"/>
               <w:noProof/>
               <w:kern w:val="2"/>
-              <w:sz w:val="24"/>
+              <w:sz w:val="21"/>
               <w:szCs w:val="24"/>
-              <w:lang w:eastAsia="ja-JP"/>
+              <w:lang w:val="en-US" w:eastAsia="ja-JP"/>
               <w14:ligatures w14:val="standardContextual"/>
             </w:rPr>
           </w:pPr>
-          <w:hyperlink w:anchor="_Toc238901187" w:history="1">
+          <w:hyperlink w:anchor="_Toc244018385" w:history="1">
             <w:r>
               <w:rPr>
                 <w:rStyle w:val="af8"/>
                 <w:noProof/>
-                <w:lang w:val="en-GB"/>
               </w:rPr>
               <w:t>7.1 OIM module schema</w:t>
             </w:r>
@@ -2571,7 +2507,7 @@
                 <w:noProof/>
                 <w:webHidden/>
               </w:rPr>
-              <w:instrText xml:space="preserve"> PAGEREF _Toc238901187 \h </w:instrText>
+              <w:instrText xml:space="preserve"> PAGEREF _Toc244018385 \h </w:instrText>
             </w:r>
             <w:r>
               <w:rPr>
@@ -2591,7 +2527,7 @@
                 <w:noProof/>
                 <w:webHidden/>
               </w:rPr>
-              <w:t>9</w:t>
+              <w:t>10</w:t>
             </w:r>
             <w:r>
               <w:rPr>
@@ -2605,24 +2541,23 @@
         <w:p>
           <w:pPr>
             <w:pStyle w:val="26"/>
-            <w:ind w:left="1123"/>
+            <w:ind w:leftChars="100" w:left="940" w:rightChars="227" w:right="499"/>
             <w:rPr>
               <w:rFonts w:asciiTheme="minorHAnsi" w:hAnsiTheme="minorHAnsi" w:cstheme="minorBidi"/>
               <w:b w:val="0"/>
               <w:noProof/>
               <w:kern w:val="2"/>
-              <w:sz w:val="24"/>
+              <w:sz w:val="21"/>
               <w:szCs w:val="24"/>
-              <w:lang w:eastAsia="ja-JP"/>
+              <w:lang w:val="en-US" w:eastAsia="ja-JP"/>
               <w14:ligatures w14:val="standardContextual"/>
             </w:rPr>
           </w:pPr>
-          <w:hyperlink w:anchor="_Toc238901188" w:history="1">
+          <w:hyperlink w:anchor="_Toc244018386" w:history="1">
             <w:r>
               <w:rPr>
                 <w:rStyle w:val="af8"/>
                 <w:noProof/>
-                <w:lang w:val="en-GB"/>
               </w:rPr>
               <w:t>7.2 OIM labels</w:t>
             </w:r>
@@ -2645,7 +2580,7 @@
                 <w:noProof/>
                 <w:webHidden/>
               </w:rPr>
-              <w:instrText xml:space="preserve"> PAGEREF _Toc238901188 \h </w:instrText>
+              <w:instrText xml:space="preserve"> PAGEREF _Toc244018386 \h </w:instrText>
             </w:r>
             <w:r>
               <w:rPr>
@@ -2665,7 +2600,7 @@
                 <w:noProof/>
                 <w:webHidden/>
               </w:rPr>
-              <w:t>9</w:t>
+              <w:t>10</w:t>
             </w:r>
             <w:r>
               <w:rPr>
@@ -2679,24 +2614,23 @@
         <w:p>
           <w:pPr>
             <w:pStyle w:val="26"/>
-            <w:ind w:left="1123"/>
+            <w:ind w:leftChars="100" w:left="940" w:rightChars="227" w:right="499"/>
             <w:rPr>
               <w:rFonts w:asciiTheme="minorHAnsi" w:hAnsiTheme="minorHAnsi" w:cstheme="minorBidi"/>
               <w:b w:val="0"/>
               <w:noProof/>
               <w:kern w:val="2"/>
-              <w:sz w:val="24"/>
+              <w:sz w:val="21"/>
               <w:szCs w:val="24"/>
-              <w:lang w:eastAsia="ja-JP"/>
+              <w:lang w:val="en-US" w:eastAsia="ja-JP"/>
               <w14:ligatures w14:val="standardContextual"/>
             </w:rPr>
           </w:pPr>
-          <w:hyperlink w:anchor="_Toc238901189" w:history="1">
+          <w:hyperlink w:anchor="_Toc244018387" w:history="1">
             <w:r>
               <w:rPr>
                 <w:rStyle w:val="af8"/>
                 <w:noProof/>
-                <w:lang w:val="en-GB"/>
               </w:rPr>
               <w:t>7.3 OIM module presentation linkbase</w:t>
             </w:r>
@@ -2719,7 +2653,7 @@
                 <w:noProof/>
                 <w:webHidden/>
               </w:rPr>
-              <w:instrText xml:space="preserve"> PAGEREF _Toc238901189 \h </w:instrText>
+              <w:instrText xml:space="preserve"> PAGEREF _Toc244018387 \h </w:instrText>
             </w:r>
             <w:r>
               <w:rPr>
@@ -2753,24 +2687,23 @@
         <w:p>
           <w:pPr>
             <w:pStyle w:val="26"/>
-            <w:ind w:left="1123"/>
+            <w:ind w:leftChars="100" w:left="940" w:rightChars="227" w:right="499"/>
             <w:rPr>
               <w:rFonts w:asciiTheme="minorHAnsi" w:hAnsiTheme="minorHAnsi" w:cstheme="minorBidi"/>
               <w:b w:val="0"/>
               <w:noProof/>
               <w:kern w:val="2"/>
-              <w:sz w:val="24"/>
+              <w:sz w:val="21"/>
               <w:szCs w:val="24"/>
-              <w:lang w:eastAsia="ja-JP"/>
+              <w:lang w:val="en-US" w:eastAsia="ja-JP"/>
               <w14:ligatures w14:val="standardContextual"/>
             </w:rPr>
           </w:pPr>
-          <w:hyperlink w:anchor="_Toc238901190" w:history="1">
+          <w:hyperlink w:anchor="_Toc244018388" w:history="1">
             <w:r>
               <w:rPr>
                 <w:rStyle w:val="af8"/>
                 <w:noProof/>
-                <w:lang w:val="en-GB"/>
               </w:rPr>
               <w:t>7.4 OIM Presentation Linkbase Set</w:t>
             </w:r>
@@ -2793,7 +2726,7 @@
                 <w:noProof/>
                 <w:webHidden/>
               </w:rPr>
-              <w:instrText xml:space="preserve"> PAGEREF _Toc238901190 \h </w:instrText>
+              <w:instrText xml:space="preserve"> PAGEREF _Toc244018388 \h </w:instrText>
             </w:r>
             <w:r>
               <w:rPr>
@@ -2827,24 +2760,23 @@
         <w:p>
           <w:pPr>
             <w:pStyle w:val="26"/>
-            <w:ind w:left="1123"/>
+            <w:ind w:leftChars="100" w:left="940" w:rightChars="227" w:right="499"/>
             <w:rPr>
               <w:rFonts w:asciiTheme="minorHAnsi" w:hAnsiTheme="minorHAnsi" w:cstheme="minorBidi"/>
               <w:b w:val="0"/>
               <w:noProof/>
               <w:kern w:val="2"/>
-              <w:sz w:val="24"/>
+              <w:sz w:val="21"/>
               <w:szCs w:val="24"/>
-              <w:lang w:eastAsia="ja-JP"/>
+              <w:lang w:val="en-US" w:eastAsia="ja-JP"/>
               <w14:ligatures w14:val="standardContextual"/>
             </w:rPr>
           </w:pPr>
-          <w:hyperlink w:anchor="_Toc238901191" w:history="1">
+          <w:hyperlink w:anchor="_Toc244018389" w:history="1">
             <w:r>
               <w:rPr>
                 <w:rStyle w:val="af8"/>
                 <w:noProof/>
-                <w:lang w:val="en-GB"/>
               </w:rPr>
               <w:t>7.5 OIM message entry point and DTS separation</w:t>
             </w:r>
@@ -2867,7 +2799,7 @@
                 <w:noProof/>
                 <w:webHidden/>
               </w:rPr>
-              <w:instrText xml:space="preserve"> PAGEREF _Toc238901191 \h </w:instrText>
+              <w:instrText xml:space="preserve"> PAGEREF _Toc244018389 \h </w:instrText>
             </w:r>
             <w:r>
               <w:rPr>
@@ -2901,24 +2833,23 @@
         <w:p>
           <w:pPr>
             <w:pStyle w:val="26"/>
-            <w:ind w:left="1123"/>
+            <w:ind w:leftChars="100" w:left="940" w:rightChars="227" w:right="499"/>
             <w:rPr>
               <w:rFonts w:asciiTheme="minorHAnsi" w:hAnsiTheme="minorHAnsi" w:cstheme="minorBidi"/>
               <w:b w:val="0"/>
               <w:noProof/>
               <w:kern w:val="2"/>
-              <w:sz w:val="24"/>
+              <w:sz w:val="21"/>
               <w:szCs w:val="24"/>
-              <w:lang w:eastAsia="ja-JP"/>
+              <w:lang w:val="en-US" w:eastAsia="ja-JP"/>
               <w14:ligatures w14:val="standardContextual"/>
             </w:rPr>
           </w:pPr>
-          <w:hyperlink w:anchor="_Toc238901192" w:history="1">
+          <w:hyperlink w:anchor="_Toc244018390" w:history="1">
             <w:r>
               <w:rPr>
                 <w:rStyle w:val="af8"/>
                 <w:noProof/>
-                <w:lang w:val="en-GB"/>
               </w:rPr>
               <w:t>7.6 Dimensional definition linkbase</w:t>
             </w:r>
@@ -2941,7 +2872,7 @@
                 <w:noProof/>
                 <w:webHidden/>
               </w:rPr>
-              <w:instrText xml:space="preserve"> PAGEREF _Toc238901192 \h </w:instrText>
+              <w:instrText xml:space="preserve"> PAGEREF _Toc244018390 \h </w:instrText>
             </w:r>
             <w:r>
               <w:rPr>
@@ -2961,7 +2892,7 @@
                 <w:noProof/>
                 <w:webHidden/>
               </w:rPr>
-              <w:t>10</w:t>
+              <w:t>11</w:t>
             </w:r>
             <w:r>
               <w:rPr>
@@ -2975,24 +2906,23 @@
         <w:p>
           <w:pPr>
             <w:pStyle w:val="26"/>
-            <w:ind w:left="1123"/>
+            <w:ind w:leftChars="100" w:left="940" w:rightChars="227" w:right="499"/>
             <w:rPr>
               <w:rFonts w:asciiTheme="minorHAnsi" w:hAnsiTheme="minorHAnsi" w:cstheme="minorBidi"/>
               <w:b w:val="0"/>
               <w:noProof/>
               <w:kern w:val="2"/>
-              <w:sz w:val="24"/>
+              <w:sz w:val="21"/>
               <w:szCs w:val="24"/>
-              <w:lang w:eastAsia="ja-JP"/>
+              <w:lang w:val="en-US" w:eastAsia="ja-JP"/>
               <w14:ligatures w14:val="standardContextual"/>
             </w:rPr>
           </w:pPr>
-          <w:hyperlink w:anchor="_Toc238901193" w:history="1">
+          <w:hyperlink w:anchor="_Toc244018391" w:history="1">
             <w:r>
               <w:rPr>
                 <w:rStyle w:val="af8"/>
                 <w:noProof/>
-                <w:lang w:val="en-GB"/>
               </w:rPr>
               <w:t>7.7 Linkroles and DTS discovery</w:t>
             </w:r>
@@ -3015,7 +2945,7 @@
                 <w:noProof/>
                 <w:webHidden/>
               </w:rPr>
-              <w:instrText xml:space="preserve"> PAGEREF _Toc238901193 \h </w:instrText>
+              <w:instrText xml:space="preserve"> PAGEREF _Toc244018391 \h </w:instrText>
             </w:r>
             <w:r>
               <w:rPr>
@@ -3035,7 +2965,7 @@
                 <w:noProof/>
                 <w:webHidden/>
               </w:rPr>
-              <w:t>10</w:t>
+              <w:t>11</w:t>
             </w:r>
             <w:r>
               <w:rPr>
@@ -3054,18 +2984,17 @@
               <w:b w:val="0"/>
               <w:noProof/>
               <w:kern w:val="2"/>
-              <w:sz w:val="24"/>
+              <w:sz w:val="21"/>
               <w:szCs w:val="24"/>
-              <w:lang w:eastAsia="ja-JP"/>
+              <w:lang w:val="en-US" w:eastAsia="ja-JP"/>
               <w14:ligatures w14:val="standardContextual"/>
             </w:rPr>
           </w:pPr>
-          <w:hyperlink w:anchor="_Toc238901194" w:history="1">
+          <w:hyperlink w:anchor="_Toc244018392" w:history="1">
             <w:r>
               <w:rPr>
                 <w:rStyle w:val="af8"/>
                 <w:noProof/>
-                <w:lang w:val="en-GB"/>
               </w:rPr>
               <w:t>8 xBRL-CSV metadata and data tables</w:t>
             </w:r>
@@ -3088,7 +3017,7 @@
                 <w:noProof/>
                 <w:webHidden/>
               </w:rPr>
-              <w:instrText xml:space="preserve"> PAGEREF _Toc238901194 \h </w:instrText>
+              <w:instrText xml:space="preserve"> PAGEREF _Toc244018392 \h </w:instrText>
             </w:r>
             <w:r>
               <w:rPr>
@@ -3122,24 +3051,23 @@
         <w:p>
           <w:pPr>
             <w:pStyle w:val="26"/>
-            <w:ind w:left="1123"/>
+            <w:ind w:leftChars="100" w:left="940" w:rightChars="227" w:right="499"/>
             <w:rPr>
               <w:rFonts w:asciiTheme="minorHAnsi" w:hAnsiTheme="minorHAnsi" w:cstheme="minorBidi"/>
               <w:b w:val="0"/>
               <w:noProof/>
               <w:kern w:val="2"/>
-              <w:sz w:val="24"/>
+              <w:sz w:val="21"/>
               <w:szCs w:val="24"/>
-              <w:lang w:eastAsia="ja-JP"/>
+              <w:lang w:val="en-US" w:eastAsia="ja-JP"/>
               <w14:ligatures w14:val="standardContextual"/>
             </w:rPr>
           </w:pPr>
-          <w:hyperlink w:anchor="_Toc238901195" w:history="1">
+          <w:hyperlink w:anchor="_Toc244018393" w:history="1">
             <w:r>
               <w:rPr>
                 <w:rStyle w:val="af8"/>
                 <w:noProof/>
-                <w:lang w:val="en-GB"/>
               </w:rPr>
               <w:t>8.1 Separation from taxonomy generation</w:t>
             </w:r>
@@ -3162,7 +3090,7 @@
                 <w:noProof/>
                 <w:webHidden/>
               </w:rPr>
-              <w:instrText xml:space="preserve"> PAGEREF _Toc238901195 \h </w:instrText>
+              <w:instrText xml:space="preserve"> PAGEREF _Toc244018393 \h </w:instrText>
             </w:r>
             <w:r>
               <w:rPr>
@@ -3196,24 +3124,23 @@
         <w:p>
           <w:pPr>
             <w:pStyle w:val="26"/>
-            <w:ind w:left="1123"/>
+            <w:ind w:leftChars="100" w:left="940" w:rightChars="227" w:right="499"/>
             <w:rPr>
               <w:rFonts w:asciiTheme="minorHAnsi" w:hAnsiTheme="minorHAnsi" w:cstheme="minorBidi"/>
               <w:b w:val="0"/>
               <w:noProof/>
               <w:kern w:val="2"/>
-              <w:sz w:val="24"/>
+              <w:sz w:val="21"/>
               <w:szCs w:val="24"/>
-              <w:lang w:eastAsia="ja-JP"/>
+              <w:lang w:val="en-US" w:eastAsia="ja-JP"/>
               <w14:ligatures w14:val="standardContextual"/>
             </w:rPr>
           </w:pPr>
-          <w:hyperlink w:anchor="_Toc238901196" w:history="1">
+          <w:hyperlink w:anchor="_Toc244018394" w:history="1">
             <w:r>
               <w:rPr>
                 <w:rStyle w:val="af8"/>
                 <w:noProof/>
-                <w:lang w:val="en-GB"/>
               </w:rPr>
               <w:t>8.2 documentInfo</w:t>
             </w:r>
@@ -3236,7 +3163,7 @@
                 <w:noProof/>
                 <w:webHidden/>
               </w:rPr>
-              <w:instrText xml:space="preserve"> PAGEREF _Toc238901196 \h </w:instrText>
+              <w:instrText xml:space="preserve"> PAGEREF _Toc244018394 \h </w:instrText>
             </w:r>
             <w:r>
               <w:rPr>
@@ -3270,24 +3197,23 @@
         <w:p>
           <w:pPr>
             <w:pStyle w:val="26"/>
-            <w:ind w:left="1123"/>
+            <w:ind w:leftChars="100" w:left="940" w:rightChars="227" w:right="499"/>
             <w:rPr>
               <w:rFonts w:asciiTheme="minorHAnsi" w:hAnsiTheme="minorHAnsi" w:cstheme="minorBidi"/>
               <w:b w:val="0"/>
               <w:noProof/>
               <w:kern w:val="2"/>
-              <w:sz w:val="24"/>
+              <w:sz w:val="21"/>
               <w:szCs w:val="24"/>
-              <w:lang w:eastAsia="ja-JP"/>
+              <w:lang w:val="en-US" w:eastAsia="ja-JP"/>
               <w14:ligatures w14:val="standardContextual"/>
             </w:rPr>
           </w:pPr>
-          <w:hyperlink w:anchor="_Toc238901197" w:history="1">
+          <w:hyperlink w:anchor="_Toc244018395" w:history="1">
             <w:r>
               <w:rPr>
                 <w:rStyle w:val="af8"/>
                 <w:noProof/>
-                <w:lang w:val="en-GB"/>
               </w:rPr>
               <w:t>8.3 Occurrence-key columns</w:t>
             </w:r>
@@ -3310,7 +3236,7 @@
                 <w:noProof/>
                 <w:webHidden/>
               </w:rPr>
-              <w:instrText xml:space="preserve"> PAGEREF _Toc238901197 \h </w:instrText>
+              <w:instrText xml:space="preserve"> PAGEREF _Toc244018395 \h </w:instrText>
             </w:r>
             <w:r>
               <w:rPr>
@@ -3344,24 +3270,23 @@
         <w:p>
           <w:pPr>
             <w:pStyle w:val="26"/>
-            <w:ind w:left="1123"/>
+            <w:ind w:leftChars="100" w:left="940" w:rightChars="227" w:right="499"/>
             <w:rPr>
               <w:rFonts w:asciiTheme="minorHAnsi" w:hAnsiTheme="minorHAnsi" w:cstheme="minorBidi"/>
               <w:b w:val="0"/>
               <w:noProof/>
               <w:kern w:val="2"/>
-              <w:sz w:val="24"/>
+              <w:sz w:val="21"/>
               <w:szCs w:val="24"/>
-              <w:lang w:eastAsia="ja-JP"/>
+              <w:lang w:val="en-US" w:eastAsia="ja-JP"/>
               <w14:ligatures w14:val="standardContextual"/>
             </w:rPr>
           </w:pPr>
-          <w:hyperlink w:anchor="_Toc238901198" w:history="1">
+          <w:hyperlink w:anchor="_Toc244018396" w:history="1">
             <w:r>
               <w:rPr>
                 <w:rStyle w:val="af8"/>
                 <w:noProof/>
-                <w:lang w:val="en-GB"/>
               </w:rPr>
               <w:t>8.4 Property columns</w:t>
             </w:r>
@@ -3384,7 +3309,7 @@
                 <w:noProof/>
                 <w:webHidden/>
               </w:rPr>
-              <w:instrText xml:space="preserve"> PAGEREF _Toc238901198 \h </w:instrText>
+              <w:instrText xml:space="preserve"> PAGEREF _Toc244018396 \h </w:instrText>
             </w:r>
             <w:r>
               <w:rPr>
@@ -3418,24 +3343,23 @@
         <w:p>
           <w:pPr>
             <w:pStyle w:val="26"/>
-            <w:ind w:left="1123"/>
+            <w:ind w:leftChars="100" w:left="940" w:rightChars="227" w:right="499"/>
             <w:rPr>
               <w:rFonts w:asciiTheme="minorHAnsi" w:hAnsiTheme="minorHAnsi" w:cstheme="minorBidi"/>
               <w:b w:val="0"/>
               <w:noProof/>
               <w:kern w:val="2"/>
-              <w:sz w:val="24"/>
+              <w:sz w:val="21"/>
               <w:szCs w:val="24"/>
-              <w:lang w:eastAsia="ja-JP"/>
+              <w:lang w:val="en-US" w:eastAsia="ja-JP"/>
               <w14:ligatures w14:val="standardContextual"/>
             </w:rPr>
           </w:pPr>
-          <w:hyperlink w:anchor="_Toc238901199" w:history="1">
+          <w:hyperlink w:anchor="_Toc244018397" w:history="1">
             <w:r>
               <w:rPr>
                 <w:rStyle w:val="af8"/>
                 <w:noProof/>
-                <w:lang w:val="en-GB"/>
               </w:rPr>
               <w:t>8.5 One Structured CSV per report</w:t>
             </w:r>
@@ -3458,7 +3382,7 @@
                 <w:noProof/>
                 <w:webHidden/>
               </w:rPr>
-              <w:instrText xml:space="preserve"> PAGEREF _Toc238901199 \h </w:instrText>
+              <w:instrText xml:space="preserve"> PAGEREF _Toc244018397 \h </w:instrText>
             </w:r>
             <w:r>
               <w:rPr>
@@ -3478,7 +3402,7 @@
                 <w:noProof/>
                 <w:webHidden/>
               </w:rPr>
-              <w:t>11</w:t>
+              <w:t>12</w:t>
             </w:r>
             <w:r>
               <w:rPr>
@@ -3492,24 +3416,23 @@
         <w:p>
           <w:pPr>
             <w:pStyle w:val="26"/>
-            <w:ind w:left="1123"/>
+            <w:ind w:leftChars="100" w:left="940" w:rightChars="227" w:right="499"/>
             <w:rPr>
               <w:rFonts w:asciiTheme="minorHAnsi" w:hAnsiTheme="minorHAnsi" w:cstheme="minorBidi"/>
               <w:b w:val="0"/>
               <w:noProof/>
               <w:kern w:val="2"/>
-              <w:sz w:val="24"/>
+              <w:sz w:val="21"/>
               <w:szCs w:val="24"/>
-              <w:lang w:eastAsia="ja-JP"/>
+              <w:lang w:val="en-US" w:eastAsia="ja-JP"/>
               <w14:ligatures w14:val="standardContextual"/>
             </w:rPr>
           </w:pPr>
-          <w:hyperlink w:anchor="_Toc238901200" w:history="1">
+          <w:hyperlink w:anchor="_Toc244018398" w:history="1">
             <w:r>
               <w:rPr>
                 <w:rStyle w:val="af8"/>
                 <w:noProof/>
-                <w:lang w:val="en-GB"/>
               </w:rPr>
               <w:t>8.6 Reading a Structured CSV row through the cube</w:t>
             </w:r>
@@ -3532,7 +3455,7 @@
                 <w:noProof/>
                 <w:webHidden/>
               </w:rPr>
-              <w:instrText xml:space="preserve"> PAGEREF _Toc238901200 \h </w:instrText>
+              <w:instrText xml:space="preserve"> PAGEREF _Toc244018398 \h </w:instrText>
             </w:r>
             <w:r>
               <w:rPr>
@@ -3552,7 +3475,7 @@
                 <w:noProof/>
                 <w:webHidden/>
               </w:rPr>
-              <w:t>11</w:t>
+              <w:t>12</w:t>
             </w:r>
             <w:r>
               <w:rPr>
@@ -3566,24 +3489,23 @@
         <w:p>
           <w:pPr>
             <w:pStyle w:val="26"/>
-            <w:ind w:left="1123"/>
+            <w:ind w:leftChars="100" w:left="940" w:rightChars="227" w:right="499"/>
             <w:rPr>
               <w:rFonts w:asciiTheme="minorHAnsi" w:hAnsiTheme="minorHAnsi" w:cstheme="minorBidi"/>
               <w:b w:val="0"/>
               <w:noProof/>
               <w:kern w:val="2"/>
-              <w:sz w:val="24"/>
+              <w:sz w:val="21"/>
               <w:szCs w:val="24"/>
-              <w:lang w:eastAsia="ja-JP"/>
+              <w:lang w:val="en-US" w:eastAsia="ja-JP"/>
               <w14:ligatures w14:val="standardContextual"/>
             </w:rPr>
           </w:pPr>
-          <w:hyperlink w:anchor="_Toc238901201" w:history="1">
+          <w:hyperlink w:anchor="_Toc244018399" w:history="1">
             <w:r>
               <w:rPr>
                 <w:rStyle w:val="af8"/>
                 <w:noProof/>
-                <w:lang w:val="en-GB"/>
               </w:rPr>
               <w:t>8.7 Report validation</w:t>
             </w:r>
@@ -3606,7 +3528,7 @@
                 <w:noProof/>
                 <w:webHidden/>
               </w:rPr>
-              <w:instrText xml:space="preserve"> PAGEREF _Toc238901201 \h </w:instrText>
+              <w:instrText xml:space="preserve"> PAGEREF _Toc244018399 \h </w:instrText>
             </w:r>
             <w:r>
               <w:rPr>
@@ -3640,24 +3562,23 @@
         <w:p>
           <w:pPr>
             <w:pStyle w:val="26"/>
-            <w:ind w:left="1123"/>
+            <w:ind w:leftChars="100" w:left="940" w:rightChars="227" w:right="499"/>
             <w:rPr>
               <w:rFonts w:asciiTheme="minorHAnsi" w:hAnsiTheme="minorHAnsi" w:cstheme="minorBidi"/>
               <w:b w:val="0"/>
               <w:noProof/>
               <w:kern w:val="2"/>
-              <w:sz w:val="24"/>
+              <w:sz w:val="21"/>
               <w:szCs w:val="24"/>
-              <w:lang w:eastAsia="ja-JP"/>
+              <w:lang w:val="en-US" w:eastAsia="ja-JP"/>
               <w14:ligatures w14:val="standardContextual"/>
             </w:rPr>
           </w:pPr>
-          <w:hyperlink w:anchor="_Toc238901202" w:history="1">
+          <w:hyperlink w:anchor="_Toc244018400" w:history="1">
             <w:r>
               <w:rPr>
                 <w:rStyle w:val="af8"/>
                 <w:noProof/>
-                <w:lang w:val="en-GB"/>
               </w:rPr>
               <w:t>8.8 Shared `gen` module, Value Domains, and Structured CSV</w:t>
             </w:r>
@@ -3680,7 +3601,7 @@
                 <w:noProof/>
                 <w:webHidden/>
               </w:rPr>
-              <w:instrText xml:space="preserve"> PAGEREF _Toc238901202 \h </w:instrText>
+              <w:instrText xml:space="preserve"> PAGEREF _Toc244018400 \h </w:instrText>
             </w:r>
             <w:r>
               <w:rPr>
@@ -3714,24 +3635,23 @@
         <w:p>
           <w:pPr>
             <w:pStyle w:val="26"/>
-            <w:ind w:left="1123"/>
+            <w:ind w:leftChars="100" w:left="940" w:rightChars="227" w:right="499"/>
             <w:rPr>
               <w:rFonts w:asciiTheme="minorHAnsi" w:hAnsiTheme="minorHAnsi" w:cstheme="minorBidi"/>
               <w:b w:val="0"/>
               <w:noProof/>
               <w:kern w:val="2"/>
-              <w:sz w:val="24"/>
+              <w:sz w:val="21"/>
               <w:szCs w:val="24"/>
-              <w:lang w:eastAsia="ja-JP"/>
+              <w:lang w:val="en-US" w:eastAsia="ja-JP"/>
               <w14:ligatures w14:val="standardContextual"/>
             </w:rPr>
           </w:pPr>
-          <w:hyperlink w:anchor="_Toc238901203" w:history="1">
+          <w:hyperlink w:anchor="_Toc244018401" w:history="1">
             <w:r>
               <w:rPr>
                 <w:rStyle w:val="af8"/>
                 <w:noProof/>
-                <w:lang w:val="en-GB"/>
               </w:rPr>
               <w:t>8.9 Implemented occurrence and Value Domain rules</w:t>
             </w:r>
@@ -3754,7 +3674,7 @@
                 <w:noProof/>
                 <w:webHidden/>
               </w:rPr>
-              <w:instrText xml:space="preserve"> PAGEREF _Toc238901203 \h </w:instrText>
+              <w:instrText xml:space="preserve"> PAGEREF _Toc244018401 \h </w:instrText>
             </w:r>
             <w:r>
               <w:rPr>
@@ -3793,18 +3713,17 @@
               <w:b w:val="0"/>
               <w:noProof/>
               <w:kern w:val="2"/>
-              <w:sz w:val="24"/>
+              <w:sz w:val="21"/>
               <w:szCs w:val="24"/>
-              <w:lang w:eastAsia="ja-JP"/>
+              <w:lang w:val="en-US" w:eastAsia="ja-JP"/>
               <w14:ligatures w14:val="standardContextual"/>
             </w:rPr>
           </w:pPr>
-          <w:hyperlink w:anchor="_Toc238901204" w:history="1">
+          <w:hyperlink w:anchor="_Toc244018402" w:history="1">
             <w:r>
               <w:rPr>
                 <w:rStyle w:val="af8"/>
                 <w:noProof/>
-                <w:lang w:val="en-GB"/>
               </w:rPr>
               <w:t>9 Cross-binding equivalence</w:t>
             </w:r>
@@ -3827,7 +3746,7 @@
                 <w:noProof/>
                 <w:webHidden/>
               </w:rPr>
-              <w:instrText xml:space="preserve"> PAGEREF _Toc238901204 \h </w:instrText>
+              <w:instrText xml:space="preserve"> PAGEREF _Toc244018402 \h </w:instrText>
             </w:r>
             <w:r>
               <w:rPr>
@@ -3866,18 +3785,17 @@
               <w:b w:val="0"/>
               <w:noProof/>
               <w:kern w:val="2"/>
-              <w:sz w:val="24"/>
+              <w:sz w:val="21"/>
               <w:szCs w:val="24"/>
-              <w:lang w:eastAsia="ja-JP"/>
+              <w:lang w:val="en-US" w:eastAsia="ja-JP"/>
               <w14:ligatures w14:val="standardContextual"/>
             </w:rPr>
           </w:pPr>
-          <w:hyperlink w:anchor="_Toc238901205" w:history="1">
+          <w:hyperlink w:anchor="_Toc244018403" w:history="1">
             <w:r>
               <w:rPr>
                 <w:rStyle w:val="af8"/>
                 <w:noProof/>
-                <w:lang w:val="en-GB"/>
               </w:rPr>
               <w:t>10 accountingEntries baseline and businessTransactions additional HMD (informative)</w:t>
             </w:r>
@@ -3900,7 +3818,7 @@
                 <w:noProof/>
                 <w:webHidden/>
               </w:rPr>
-              <w:instrText xml:space="preserve"> PAGEREF _Toc238901205 \h </w:instrText>
+              <w:instrText xml:space="preserve"> PAGEREF _Toc244018403 \h </w:instrText>
             </w:r>
             <w:r>
               <w:rPr>
@@ -3920,7 +3838,7 @@
                 <w:noProof/>
                 <w:webHidden/>
               </w:rPr>
-              <w:t>13</w:t>
+              <w:t>14</w:t>
             </w:r>
             <w:r>
               <w:rPr>
@@ -3939,18 +3857,17 @@
               <w:b w:val="0"/>
               <w:noProof/>
               <w:kern w:val="2"/>
-              <w:sz w:val="24"/>
+              <w:sz w:val="21"/>
               <w:szCs w:val="24"/>
-              <w:lang w:eastAsia="ja-JP"/>
+              <w:lang w:val="en-US" w:eastAsia="ja-JP"/>
               <w14:ligatures w14:val="standardContextual"/>
             </w:rPr>
           </w:pPr>
-          <w:hyperlink w:anchor="_Toc238901206" w:history="1">
+          <w:hyperlink w:anchor="_Toc244018404" w:history="1">
             <w:r>
               <w:rPr>
                 <w:rStyle w:val="af8"/>
                 <w:noProof/>
-                <w:lang w:val="en-GB"/>
               </w:rPr>
               <w:t>11 Formal package assembly</w:t>
             </w:r>
@@ -3973,7 +3890,7 @@
                 <w:noProof/>
                 <w:webHidden/>
               </w:rPr>
-              <w:instrText xml:space="preserve"> PAGEREF _Toc238901206 \h </w:instrText>
+              <w:instrText xml:space="preserve"> PAGEREF _Toc244018404 \h </w:instrText>
             </w:r>
             <w:r>
               <w:rPr>
@@ -4007,24 +3924,23 @@
         <w:p>
           <w:pPr>
             <w:pStyle w:val="26"/>
-            <w:ind w:left="1123"/>
+            <w:ind w:leftChars="100" w:left="940" w:rightChars="227" w:right="499"/>
             <w:rPr>
               <w:rFonts w:asciiTheme="minorHAnsi" w:hAnsiTheme="minorHAnsi" w:cstheme="minorBidi"/>
               <w:b w:val="0"/>
               <w:noProof/>
               <w:kern w:val="2"/>
-              <w:sz w:val="24"/>
+              <w:sz w:val="21"/>
               <w:szCs w:val="24"/>
-              <w:lang w:eastAsia="ja-JP"/>
+              <w:lang w:val="en-US" w:eastAsia="ja-JP"/>
               <w14:ligatures w14:val="standardContextual"/>
             </w:rPr>
           </w:pPr>
-          <w:hyperlink w:anchor="_Toc238901207" w:history="1">
+          <w:hyperlink w:anchor="_Toc244018405" w:history="1">
             <w:r>
               <w:rPr>
                 <w:rStyle w:val="af8"/>
                 <w:noProof/>
-                <w:lang w:val="en-GB"/>
               </w:rPr>
               <w:t>11.1 Formal package tree</w:t>
             </w:r>
@@ -4047,7 +3963,7 @@
                 <w:noProof/>
                 <w:webHidden/>
               </w:rPr>
-              <w:instrText xml:space="preserve"> PAGEREF _Toc238901207 \h </w:instrText>
+              <w:instrText xml:space="preserve"> PAGEREF _Toc244018405 \h </w:instrText>
             </w:r>
             <w:r>
               <w:rPr>
@@ -4081,24 +3997,23 @@
         <w:p>
           <w:pPr>
             <w:pStyle w:val="26"/>
-            <w:ind w:left="1123"/>
+            <w:ind w:leftChars="100" w:left="940" w:rightChars="227" w:right="499"/>
             <w:rPr>
               <w:rFonts w:asciiTheme="minorHAnsi" w:hAnsiTheme="minorHAnsi" w:cstheme="minorBidi"/>
               <w:b w:val="0"/>
               <w:noProof/>
               <w:kern w:val="2"/>
-              <w:sz w:val="24"/>
+              <w:sz w:val="21"/>
               <w:szCs w:val="24"/>
-              <w:lang w:eastAsia="ja-JP"/>
+              <w:lang w:val="en-US" w:eastAsia="ja-JP"/>
               <w14:ligatures w14:val="standardContextual"/>
             </w:rPr>
           </w:pPr>
-          <w:hyperlink w:anchor="_Toc238901208" w:history="1">
+          <w:hyperlink w:anchor="_Toc244018406" w:history="1">
             <w:r>
               <w:rPr>
                 <w:rStyle w:val="af8"/>
                 <w:noProof/>
-                <w:lang w:val="en-GB"/>
               </w:rPr>
               <w:t>11.2 Version and namespaces</w:t>
             </w:r>
@@ -4121,7 +4036,7 @@
                 <w:noProof/>
                 <w:webHidden/>
               </w:rPr>
-              <w:instrText xml:space="preserve"> PAGEREF _Toc238901208 \h </w:instrText>
+              <w:instrText xml:space="preserve"> PAGEREF _Toc244018406 \h </w:instrText>
             </w:r>
             <w:r>
               <w:rPr>
@@ -4155,24 +4070,23 @@
         <w:p>
           <w:pPr>
             <w:pStyle w:val="26"/>
-            <w:ind w:left="1123"/>
+            <w:ind w:leftChars="100" w:left="940" w:rightChars="227" w:right="499"/>
             <w:rPr>
               <w:rFonts w:asciiTheme="minorHAnsi" w:hAnsiTheme="minorHAnsi" w:cstheme="minorBidi"/>
               <w:b w:val="0"/>
               <w:noProof/>
               <w:kern w:val="2"/>
-              <w:sz w:val="24"/>
+              <w:sz w:val="21"/>
               <w:szCs w:val="24"/>
-              <w:lang w:eastAsia="ja-JP"/>
+              <w:lang w:val="en-US" w:eastAsia="ja-JP"/>
               <w14:ligatures w14:val="standardContextual"/>
             </w:rPr>
           </w:pPr>
-          <w:hyperlink w:anchor="_Toc238901209" w:history="1">
+          <w:hyperlink w:anchor="_Toc244018407" w:history="1">
             <w:r>
               <w:rPr>
                 <w:rStyle w:val="af8"/>
                 <w:noProof/>
-                <w:lang w:val="en-GB"/>
               </w:rPr>
               <w:t>11.3 Deterministic HMD identifier</w:t>
             </w:r>
@@ -4195,7 +4109,7 @@
                 <w:noProof/>
                 <w:webHidden/>
               </w:rPr>
-              <w:instrText xml:space="preserve"> PAGEREF _Toc238901209 \h </w:instrText>
+              <w:instrText xml:space="preserve"> PAGEREF _Toc244018407 \h </w:instrText>
             </w:r>
             <w:r>
               <w:rPr>
@@ -4229,24 +4143,23 @@
         <w:p>
           <w:pPr>
             <w:pStyle w:val="26"/>
-            <w:ind w:left="1123"/>
+            <w:ind w:leftChars="100" w:left="940" w:rightChars="227" w:right="499"/>
             <w:rPr>
               <w:rFonts w:asciiTheme="minorHAnsi" w:hAnsiTheme="minorHAnsi" w:cstheme="minorBidi"/>
               <w:b w:val="0"/>
               <w:noProof/>
               <w:kern w:val="2"/>
-              <w:sz w:val="24"/>
+              <w:sz w:val="21"/>
               <w:szCs w:val="24"/>
-              <w:lang w:eastAsia="ja-JP"/>
+              <w:lang w:val="en-US" w:eastAsia="ja-JP"/>
               <w14:ligatures w14:val="standardContextual"/>
             </w:rPr>
           </w:pPr>
-          <w:hyperlink w:anchor="_Toc238901210" w:history="1">
+          <w:hyperlink w:anchor="_Toc244018408" w:history="1">
             <w:r>
               <w:rPr>
                 <w:rStyle w:val="af8"/>
                 <w:noProof/>
-                <w:lang w:val="en-GB"/>
               </w:rPr>
               <w:t>11.4 All-or-nothing publication</w:t>
             </w:r>
@@ -4269,7 +4182,7 @@
                 <w:noProof/>
                 <w:webHidden/>
               </w:rPr>
-              <w:instrText xml:space="preserve"> PAGEREF _Toc238901210 \h </w:instrText>
+              <w:instrText xml:space="preserve"> PAGEREF _Toc244018408 \h </w:instrText>
             </w:r>
             <w:r>
               <w:rPr>
@@ -4308,18 +4221,17 @@
               <w:b w:val="0"/>
               <w:noProof/>
               <w:kern w:val="2"/>
-              <w:sz w:val="24"/>
+              <w:sz w:val="21"/>
               <w:szCs w:val="24"/>
-              <w:lang w:eastAsia="ja-JP"/>
+              <w:lang w:val="en-US" w:eastAsia="ja-JP"/>
               <w14:ligatures w14:val="standardContextual"/>
             </w:rPr>
           </w:pPr>
-          <w:hyperlink w:anchor="_Toc238901211" w:history="1">
+          <w:hyperlink w:anchor="_Toc244018409" w:history="1">
             <w:r>
               <w:rPr>
                 <w:rStyle w:val="af8"/>
                 <w:noProof/>
-                <w:lang w:val="en-GB"/>
               </w:rPr>
               <w:t>12 Validation and conformance</w:t>
             </w:r>
@@ -4342,7 +4254,7 @@
                 <w:noProof/>
                 <w:webHidden/>
               </w:rPr>
-              <w:instrText xml:space="preserve"> PAGEREF _Toc238901211 \h </w:instrText>
+              <w:instrText xml:space="preserve"> PAGEREF _Toc244018409 \h </w:instrText>
             </w:r>
             <w:r>
               <w:rPr>
@@ -4376,24 +4288,23 @@
         <w:p>
           <w:pPr>
             <w:pStyle w:val="26"/>
-            <w:ind w:left="1123"/>
+            <w:ind w:leftChars="100" w:left="940" w:rightChars="227" w:right="499"/>
             <w:rPr>
               <w:rFonts w:asciiTheme="minorHAnsi" w:hAnsiTheme="minorHAnsi" w:cstheme="minorBidi"/>
               <w:b w:val="0"/>
               <w:noProof/>
               <w:kern w:val="2"/>
-              <w:sz w:val="24"/>
+              <w:sz w:val="21"/>
               <w:szCs w:val="24"/>
-              <w:lang w:eastAsia="ja-JP"/>
+              <w:lang w:val="en-US" w:eastAsia="ja-JP"/>
               <w14:ligatures w14:val="standardContextual"/>
             </w:rPr>
           </w:pPr>
-          <w:hyperlink w:anchor="_Toc238901212" w:history="1">
+          <w:hyperlink w:anchor="_Toc244018410" w:history="1">
             <w:r>
               <w:rPr>
                 <w:rStyle w:val="af8"/>
                 <w:noProof/>
-                <w:lang w:val="en-GB"/>
               </w:rPr>
               <w:t>12.1 Taxonomy conformance</w:t>
             </w:r>
@@ -4416,7 +4327,7 @@
                 <w:noProof/>
                 <w:webHidden/>
               </w:rPr>
-              <w:instrText xml:space="preserve"> PAGEREF _Toc238901212 \h </w:instrText>
+              <w:instrText xml:space="preserve"> PAGEREF _Toc244018410 \h </w:instrText>
             </w:r>
             <w:r>
               <w:rPr>
@@ -4450,24 +4361,23 @@
         <w:p>
           <w:pPr>
             <w:pStyle w:val="26"/>
-            <w:ind w:left="1123"/>
+            <w:ind w:leftChars="100" w:left="940" w:rightChars="227" w:right="499"/>
             <w:rPr>
               <w:rFonts w:asciiTheme="minorHAnsi" w:hAnsiTheme="minorHAnsi" w:cstheme="minorBidi"/>
               <w:b w:val="0"/>
               <w:noProof/>
               <w:kern w:val="2"/>
-              <w:sz w:val="24"/>
+              <w:sz w:val="21"/>
               <w:szCs w:val="24"/>
-              <w:lang w:eastAsia="ja-JP"/>
+              <w:lang w:val="en-US" w:eastAsia="ja-JP"/>
               <w14:ligatures w14:val="standardContextual"/>
             </w:rPr>
           </w:pPr>
-          <w:hyperlink w:anchor="_Toc238901213" w:history="1">
+          <w:hyperlink w:anchor="_Toc244018411" w:history="1">
             <w:r>
               <w:rPr>
                 <w:rStyle w:val="af8"/>
                 <w:noProof/>
-                <w:lang w:val="en-GB"/>
               </w:rPr>
               <w:t>12.2 Minimum report tests</w:t>
             </w:r>
@@ -4490,7 +4400,7 @@
                 <w:noProof/>
                 <w:webHidden/>
               </w:rPr>
-              <w:instrText xml:space="preserve"> PAGEREF _Toc238901213 \h </w:instrText>
+              <w:instrText xml:space="preserve"> PAGEREF _Toc244018411 \h </w:instrText>
             </w:r>
             <w:r>
               <w:rPr>
@@ -4529,18 +4439,17 @@
               <w:b w:val="0"/>
               <w:noProof/>
               <w:kern w:val="2"/>
-              <w:sz w:val="24"/>
+              <w:sz w:val="21"/>
               <w:szCs w:val="24"/>
-              <w:lang w:eastAsia="ja-JP"/>
+              <w:lang w:val="en-US" w:eastAsia="ja-JP"/>
               <w14:ligatures w14:val="standardContextual"/>
             </w:rPr>
           </w:pPr>
-          <w:hyperlink w:anchor="_Toc238901214" w:history="1">
+          <w:hyperlink w:anchor="_Toc244018412" w:history="1">
             <w:r>
               <w:rPr>
                 <w:rStyle w:val="af8"/>
                 <w:noProof/>
-                <w:lang w:val="en-GB"/>
               </w:rPr>
               <w:t>13 Normative output-name summary</w:t>
             </w:r>
@@ -4563,7 +4472,7 @@
                 <w:noProof/>
                 <w:webHidden/>
               </w:rPr>
-              <w:instrText xml:space="preserve"> PAGEREF _Toc238901214 \h </w:instrText>
+              <w:instrText xml:space="preserve"> PAGEREF _Toc244018412 \h </w:instrText>
             </w:r>
             <w:r>
               <w:rPr>
@@ -4602,18 +4511,17 @@
               <w:b w:val="0"/>
               <w:noProof/>
               <w:kern w:val="2"/>
-              <w:sz w:val="24"/>
+              <w:sz w:val="21"/>
               <w:szCs w:val="24"/>
-              <w:lang w:eastAsia="ja-JP"/>
+              <w:lang w:val="en-US" w:eastAsia="ja-JP"/>
               <w14:ligatures w14:val="standardContextual"/>
             </w:rPr>
           </w:pPr>
-          <w:hyperlink w:anchor="_Toc238901215" w:history="1">
+          <w:hyperlink w:anchor="_Toc244018413" w:history="1">
             <w:r>
               <w:rPr>
                 <w:rStyle w:val="af8"/>
                 <w:noProof/>
-                <w:lang w:val="en-GB"/>
               </w:rPr>
               <w:t>14 xBRL-CSV instance examples (informative)</w:t>
             </w:r>
@@ -4636,7 +4544,7 @@
                 <w:noProof/>
                 <w:webHidden/>
               </w:rPr>
-              <w:instrText xml:space="preserve"> PAGEREF _Toc238901215 \h </w:instrText>
+              <w:instrText xml:space="preserve"> PAGEREF _Toc244018413 \h </w:instrText>
             </w:r>
             <w:r>
               <w:rPr>
@@ -4670,24 +4578,23 @@
         <w:p>
           <w:pPr>
             <w:pStyle w:val="26"/>
-            <w:ind w:left="1123"/>
+            <w:ind w:leftChars="100" w:left="940" w:rightChars="227" w:right="499"/>
             <w:rPr>
               <w:rFonts w:asciiTheme="minorHAnsi" w:hAnsiTheme="minorHAnsi" w:cstheme="minorBidi"/>
               <w:b w:val="0"/>
               <w:noProof/>
               <w:kern w:val="2"/>
-              <w:sz w:val="24"/>
+              <w:sz w:val="21"/>
               <w:szCs w:val="24"/>
-              <w:lang w:eastAsia="ja-JP"/>
+              <w:lang w:val="en-US" w:eastAsia="ja-JP"/>
               <w14:ligatures w14:val="standardContextual"/>
             </w:rPr>
           </w:pPr>
-          <w:hyperlink w:anchor="_Toc238901216" w:history="1">
+          <w:hyperlink w:anchor="_Toc244018414" w:history="1">
             <w:r>
               <w:rPr>
                 <w:rStyle w:val="af8"/>
                 <w:noProof/>
-                <w:lang w:val="en-GB"/>
               </w:rPr>
               <w:t>14.1 Example files</w:t>
             </w:r>
@@ -4710,7 +4617,7 @@
                 <w:noProof/>
                 <w:webHidden/>
               </w:rPr>
-              <w:instrText xml:space="preserve"> PAGEREF _Toc238901216 \h </w:instrText>
+              <w:instrText xml:space="preserve"> PAGEREF _Toc244018414 \h </w:instrText>
             </w:r>
             <w:r>
               <w:rPr>
@@ -4744,24 +4651,23 @@
         <w:p>
           <w:pPr>
             <w:pStyle w:val="26"/>
-            <w:ind w:left="1123"/>
+            <w:ind w:leftChars="100" w:left="940" w:rightChars="227" w:right="499"/>
             <w:rPr>
               <w:rFonts w:asciiTheme="minorHAnsi" w:hAnsiTheme="minorHAnsi" w:cstheme="minorBidi"/>
               <w:b w:val="0"/>
               <w:noProof/>
               <w:kern w:val="2"/>
-              <w:sz w:val="24"/>
+              <w:sz w:val="21"/>
               <w:szCs w:val="24"/>
-              <w:lang w:eastAsia="ja-JP"/>
+              <w:lang w:val="en-US" w:eastAsia="ja-JP"/>
               <w14:ligatures w14:val="standardContextual"/>
             </w:rPr>
           </w:pPr>
-          <w:hyperlink w:anchor="_Toc238901217" w:history="1">
+          <w:hyperlink w:anchor="_Toc244018415" w:history="1">
             <w:r>
               <w:rPr>
                 <w:rStyle w:val="af8"/>
                 <w:noProof/>
-                <w:lang w:val="en-GB"/>
               </w:rPr>
               <w:t>14.2 Accounting Entries example</w:t>
             </w:r>
@@ -4784,7 +4690,7 @@
                 <w:noProof/>
                 <w:webHidden/>
               </w:rPr>
-              <w:instrText xml:space="preserve"> PAGEREF _Toc238901217 \h </w:instrText>
+              <w:instrText xml:space="preserve"> PAGEREF _Toc244018415 \h </w:instrText>
             </w:r>
             <w:r>
               <w:rPr>
@@ -4818,24 +4724,23 @@
         <w:p>
           <w:pPr>
             <w:pStyle w:val="26"/>
-            <w:ind w:left="1123"/>
+            <w:ind w:leftChars="100" w:left="940" w:rightChars="227" w:right="499"/>
             <w:rPr>
               <w:rFonts w:asciiTheme="minorHAnsi" w:hAnsiTheme="minorHAnsi" w:cstheme="minorBidi"/>
               <w:b w:val="0"/>
               <w:noProof/>
               <w:kern w:val="2"/>
-              <w:sz w:val="24"/>
+              <w:sz w:val="21"/>
               <w:szCs w:val="24"/>
-              <w:lang w:eastAsia="ja-JP"/>
+              <w:lang w:val="en-US" w:eastAsia="ja-JP"/>
               <w14:ligatures w14:val="standardContextual"/>
             </w:rPr>
           </w:pPr>
-          <w:hyperlink w:anchor="_Toc238901218" w:history="1">
+          <w:hyperlink w:anchor="_Toc244018416" w:history="1">
             <w:r>
               <w:rPr>
                 <w:rStyle w:val="af8"/>
                 <w:noProof/>
-                <w:lang w:val="en-GB"/>
               </w:rPr>
               <w:t>14.3 Business Transactions example</w:t>
             </w:r>
@@ -4858,7 +4763,7 @@
                 <w:noProof/>
                 <w:webHidden/>
               </w:rPr>
-              <w:instrText xml:space="preserve"> PAGEREF _Toc238901218 \h </w:instrText>
+              <w:instrText xml:space="preserve"> PAGEREF _Toc244018416 \h </w:instrText>
             </w:r>
             <w:r>
               <w:rPr>
@@ -4878,7 +4783,7 @@
                 <w:noProof/>
                 <w:webHidden/>
               </w:rPr>
-              <w:t>19</w:t>
+              <w:t>20</w:t>
             </w:r>
             <w:r>
               <w:rPr>
@@ -4892,24 +4797,23 @@
         <w:p>
           <w:pPr>
             <w:pStyle w:val="26"/>
-            <w:ind w:left="1123"/>
+            <w:ind w:leftChars="100" w:left="940" w:rightChars="227" w:right="499"/>
             <w:rPr>
               <w:rFonts w:asciiTheme="minorHAnsi" w:hAnsiTheme="minorHAnsi" w:cstheme="minorBidi"/>
               <w:b w:val="0"/>
               <w:noProof/>
               <w:kern w:val="2"/>
-              <w:sz w:val="24"/>
+              <w:sz w:val="21"/>
               <w:szCs w:val="24"/>
-              <w:lang w:eastAsia="ja-JP"/>
+              <w:lang w:val="en-US" w:eastAsia="ja-JP"/>
               <w14:ligatures w14:val="standardContextual"/>
             </w:rPr>
           </w:pPr>
-          <w:hyperlink w:anchor="_Toc238901219" w:history="1">
+          <w:hyperlink w:anchor="_Toc244018417" w:history="1">
             <w:r>
               <w:rPr>
                 <w:rStyle w:val="af8"/>
                 <w:noProof/>
-                <w:lang w:val="en-GB"/>
               </w:rPr>
               <w:t>14.4 Concepts, dimensions, and presentation</w:t>
             </w:r>
@@ -4932,7 +4836,7 @@
                 <w:noProof/>
                 <w:webHidden/>
               </w:rPr>
-              <w:instrText xml:space="preserve"> PAGEREF _Toc238901219 \h </w:instrText>
+              <w:instrText xml:space="preserve"> PAGEREF _Toc244018417 \h </w:instrText>
             </w:r>
             <w:r>
               <w:rPr>
@@ -4966,24 +4870,23 @@
         <w:p>
           <w:pPr>
             <w:pStyle w:val="26"/>
-            <w:ind w:left="1123"/>
+            <w:ind w:leftChars="100" w:left="940" w:rightChars="227" w:right="499"/>
             <w:rPr>
               <w:rFonts w:asciiTheme="minorHAnsi" w:hAnsiTheme="minorHAnsi" w:cstheme="minorBidi"/>
               <w:b w:val="0"/>
               <w:noProof/>
               <w:kern w:val="2"/>
-              <w:sz w:val="24"/>
+              <w:sz w:val="21"/>
               <w:szCs w:val="24"/>
-              <w:lang w:eastAsia="ja-JP"/>
+              <w:lang w:val="en-US" w:eastAsia="ja-JP"/>
               <w14:ligatures w14:val="standardContextual"/>
             </w:rPr>
           </w:pPr>
-          <w:hyperlink w:anchor="_Toc238901220" w:history="1">
+          <w:hyperlink w:anchor="_Toc244018418" w:history="1">
             <w:r>
               <w:rPr>
                 <w:rStyle w:val="af8"/>
                 <w:noProof/>
-                <w:lang w:val="en-GB"/>
               </w:rPr>
               <w:t>14.5 Unit handling</w:t>
             </w:r>
@@ -5006,7 +4909,7 @@
                 <w:noProof/>
                 <w:webHidden/>
               </w:rPr>
-              <w:instrText xml:space="preserve"> PAGEREF _Toc238901220 \h </w:instrText>
+              <w:instrText xml:space="preserve"> PAGEREF _Toc244018418 \h </w:instrText>
             </w:r>
             <w:r>
               <w:rPr>
@@ -5048,18 +4951,17 @@
               <w:b w:val="0"/>
               <w:noProof/>
               <w:kern w:val="2"/>
-              <w:sz w:val="24"/>
+              <w:sz w:val="21"/>
               <w:szCs w:val="24"/>
-              <w:lang w:eastAsia="ja-JP"/>
+              <w:lang w:val="en-US" w:eastAsia="ja-JP"/>
               <w14:ligatures w14:val="standardContextual"/>
             </w:rPr>
           </w:pPr>
-          <w:hyperlink w:anchor="_Toc238901221" w:history="1">
+          <w:hyperlink w:anchor="_Toc244018419" w:history="1">
             <w:r>
               <w:rPr>
                 <w:rStyle w:val="af8"/>
                 <w:noProof/>
-                <w:lang w:val="en-GB"/>
               </w:rPr>
               <w:t>Appendix A</w:t>
             </w:r>
@@ -5069,9 +4971,9 @@
                 <w:b w:val="0"/>
                 <w:noProof/>
                 <w:kern w:val="2"/>
-                <w:sz w:val="24"/>
+                <w:sz w:val="21"/>
                 <w:szCs w:val="24"/>
-                <w:lang w:eastAsia="ja-JP"/>
+                <w:lang w:val="en-US" w:eastAsia="ja-JP"/>
                 <w14:ligatures w14:val="standardContextual"/>
               </w:rPr>
               <w:tab/>
@@ -5080,7 +4982,6 @@
               <w:rPr>
                 <w:rStyle w:val="af8"/>
                 <w:noProof/>
-                <w:lang w:val="en-GB"/>
               </w:rPr>
               <w:t>References</w:t>
             </w:r>
@@ -5103,7 +5004,7 @@
                 <w:noProof/>
                 <w:webHidden/>
               </w:rPr>
-              <w:instrText xml:space="preserve"> PAGEREF _Toc238901221 \h </w:instrText>
+              <w:instrText xml:space="preserve"> PAGEREF _Toc244018419 \h </w:instrText>
             </w:r>
             <w:r>
               <w:rPr>
@@ -5145,18 +5046,17 @@
               <w:b w:val="0"/>
               <w:noProof/>
               <w:kern w:val="2"/>
-              <w:sz w:val="24"/>
+              <w:sz w:val="21"/>
               <w:szCs w:val="24"/>
-              <w:lang w:eastAsia="ja-JP"/>
+              <w:lang w:val="en-US" w:eastAsia="ja-JP"/>
               <w14:ligatures w14:val="standardContextual"/>
             </w:rPr>
           </w:pPr>
-          <w:hyperlink w:anchor="_Toc238901222" w:history="1">
+          <w:hyperlink w:anchor="_Toc244018420" w:history="1">
             <w:r>
               <w:rPr>
                 <w:rStyle w:val="af8"/>
                 <w:noProof/>
-                <w:lang w:val="en-GB"/>
               </w:rPr>
               <w:t>Appendix B</w:t>
             </w:r>
@@ -5166,9 +5066,9 @@
                 <w:b w:val="0"/>
                 <w:noProof/>
                 <w:kern w:val="2"/>
-                <w:sz w:val="24"/>
+                <w:sz w:val="21"/>
                 <w:szCs w:val="24"/>
-                <w:lang w:eastAsia="ja-JP"/>
+                <w:lang w:val="en-US" w:eastAsia="ja-JP"/>
                 <w14:ligatures w14:val="standardContextual"/>
               </w:rPr>
               <w:tab/>
@@ -5177,7 +5077,6 @@
               <w:rPr>
                 <w:rStyle w:val="af8"/>
                 <w:noProof/>
-                <w:lang w:val="en-GB"/>
               </w:rPr>
               <w:t>Intellectual property status</w:t>
             </w:r>
@@ -5200,7 +5099,7 @@
                 <w:noProof/>
                 <w:webHidden/>
               </w:rPr>
-              <w:instrText xml:space="preserve"> PAGEREF _Toc238901222 \h </w:instrText>
+              <w:instrText xml:space="preserve"> PAGEREF _Toc244018420 \h </w:instrText>
             </w:r>
             <w:r>
               <w:rPr>
@@ -5242,18 +5141,17 @@
               <w:b w:val="0"/>
               <w:noProof/>
               <w:kern w:val="2"/>
-              <w:sz w:val="24"/>
+              <w:sz w:val="21"/>
               <w:szCs w:val="24"/>
-              <w:lang w:eastAsia="ja-JP"/>
+              <w:lang w:val="en-US" w:eastAsia="ja-JP"/>
               <w14:ligatures w14:val="standardContextual"/>
             </w:rPr>
           </w:pPr>
-          <w:hyperlink w:anchor="_Toc238901223" w:history="1">
+          <w:hyperlink w:anchor="_Toc244018421" w:history="1">
             <w:r>
               <w:rPr>
                 <w:rStyle w:val="af8"/>
                 <w:noProof/>
-                <w:lang w:val="en-GB"/>
               </w:rPr>
               <w:t>Appendix C</w:t>
             </w:r>
@@ -5263,9 +5161,9 @@
                 <w:b w:val="0"/>
                 <w:noProof/>
                 <w:kern w:val="2"/>
-                <w:sz w:val="24"/>
+                <w:sz w:val="21"/>
                 <w:szCs w:val="24"/>
-                <w:lang w:eastAsia="ja-JP"/>
+                <w:lang w:val="en-US" w:eastAsia="ja-JP"/>
                 <w14:ligatures w14:val="standardContextual"/>
               </w:rPr>
               <w:tab/>
@@ -5274,9 +5172,8 @@
               <w:rPr>
                 <w:rStyle w:val="af8"/>
                 <w:noProof/>
-                <w:lang w:val="en-GB"/>
-              </w:rPr>
-              <w:t>- Document history</w:t>
+              </w:rPr>
+              <w:t>Document history</w:t>
             </w:r>
             <w:r>
               <w:rPr>
@@ -5297,7 +5194,7 @@
                 <w:noProof/>
                 <w:webHidden/>
               </w:rPr>
-              <w:instrText xml:space="preserve"> PAGEREF _Toc238901223 \h </w:instrText>
+              <w:instrText xml:space="preserve"> PAGEREF _Toc244018421 \h </w:instrText>
             </w:r>
             <w:r>
               <w:rPr>
@@ -5339,18 +5236,17 @@
               <w:b w:val="0"/>
               <w:noProof/>
               <w:kern w:val="2"/>
-              <w:sz w:val="24"/>
+              <w:sz w:val="21"/>
               <w:szCs w:val="24"/>
-              <w:lang w:eastAsia="ja-JP"/>
+              <w:lang w:val="en-US" w:eastAsia="ja-JP"/>
               <w14:ligatures w14:val="standardContextual"/>
             </w:rPr>
           </w:pPr>
-          <w:hyperlink w:anchor="_Toc238901224" w:history="1">
+          <w:hyperlink w:anchor="_Toc244018422" w:history="1">
             <w:r>
               <w:rPr>
                 <w:rStyle w:val="af8"/>
                 <w:noProof/>
-                <w:lang w:val="en-GB"/>
               </w:rPr>
               <w:t>Appendix D</w:t>
             </w:r>
@@ -5360,9 +5256,9 @@
                 <w:b w:val="0"/>
                 <w:noProof/>
                 <w:kern w:val="2"/>
-                <w:sz w:val="24"/>
+                <w:sz w:val="21"/>
                 <w:szCs w:val="24"/>
-                <w:lang w:eastAsia="ja-JP"/>
+                <w:lang w:val="en-US" w:eastAsia="ja-JP"/>
                 <w14:ligatures w14:val="standardContextual"/>
               </w:rPr>
               <w:tab/>
@@ -5371,7 +5267,6 @@
               <w:rPr>
                 <w:rStyle w:val="af8"/>
                 <w:noProof/>
-                <w:lang w:val="en-GB"/>
               </w:rPr>
               <w:t>Errata corrections in this document</w:t>
             </w:r>
@@ -5394,7 +5289,7 @@
                 <w:noProof/>
                 <w:webHidden/>
               </w:rPr>
-              <w:instrText xml:space="preserve"> PAGEREF _Toc238901224 \h </w:instrText>
+              <w:instrText xml:space="preserve"> PAGEREF _Toc244018422 \h </w:instrText>
             </w:r>
             <w:r>
               <w:rPr>
@@ -5415,6 +5310,101 @@
                 <w:webHidden/>
               </w:rPr>
               <w:t>29</w:t>
+            </w:r>
+            <w:r>
+              <w:rPr>
+                <w:noProof/>
+                <w:webHidden/>
+              </w:rPr>
+              <w:fldChar w:fldCharType="end"/>
+            </w:r>
+          </w:hyperlink>
+        </w:p>
+        <w:p>
+          <w:pPr>
+            <w:pStyle w:val="12"/>
+            <w:tabs>
+              <w:tab w:val="left" w:pos="1540"/>
+            </w:tabs>
+            <w:rPr>
+              <w:rFonts w:asciiTheme="minorHAnsi" w:hAnsiTheme="minorHAnsi" w:cstheme="minorBidi"/>
+              <w:b w:val="0"/>
+              <w:noProof/>
+              <w:kern w:val="2"/>
+              <w:sz w:val="21"/>
+              <w:szCs w:val="24"/>
+              <w:lang w:val="en-US" w:eastAsia="ja-JP"/>
+              <w14:ligatures w14:val="standardContextual"/>
+            </w:rPr>
+          </w:pPr>
+          <w:hyperlink w:anchor="_Toc244018423" w:history="1">
+            <w:r>
+              <w:rPr>
+                <w:rStyle w:val="af8"/>
+                <w:noProof/>
+              </w:rPr>
+              <w:t>Appendix E</w:t>
+            </w:r>
+            <w:r>
+              <w:rPr>
+                <w:rFonts w:asciiTheme="minorHAnsi" w:hAnsiTheme="minorHAnsi" w:cstheme="minorBidi"/>
+                <w:b w:val="0"/>
+                <w:noProof/>
+                <w:kern w:val="2"/>
+                <w:sz w:val="21"/>
+                <w:szCs w:val="24"/>
+                <w:lang w:val="en-US" w:eastAsia="ja-JP"/>
+                <w14:ligatures w14:val="standardContextual"/>
+              </w:rPr>
+              <w:tab/>
+            </w:r>
+            <w:r>
+              <w:rPr>
+                <w:rStyle w:val="af8"/>
+                <w:noProof/>
+              </w:rPr>
+              <w:t>(informative) Correspondence with XBRL GL Next Requirements</w:t>
+            </w:r>
+            <w:r>
+              <w:rPr>
+                <w:noProof/>
+                <w:webHidden/>
+              </w:rPr>
+              <w:tab/>
+            </w:r>
+            <w:r>
+              <w:rPr>
+                <w:noProof/>
+                <w:webHidden/>
+              </w:rPr>
+              <w:fldChar w:fldCharType="begin"/>
+            </w:r>
+            <w:r>
+              <w:rPr>
+                <w:noProof/>
+                <w:webHidden/>
+              </w:rPr>
+              <w:instrText xml:space="preserve"> PAGEREF _Toc244018423 \h </w:instrText>
+            </w:r>
+            <w:r>
+              <w:rPr>
+                <w:noProof/>
+                <w:webHidden/>
+              </w:rPr>
+            </w:r>
+            <w:r>
+              <w:rPr>
+                <w:noProof/>
+                <w:webHidden/>
+              </w:rPr>
+              <w:fldChar w:fldCharType="separate"/>
+            </w:r>
+            <w:r>
+              <w:rPr>
+                <w:noProof/>
+                <w:webHidden/>
+              </w:rPr>
+              <w:t>30</w:t>
             </w:r>
             <w:r>
               <w:rPr>
@@ -5446,7 +5436,7 @@
       <w:pPr>
         <w:pStyle w:val="10"/>
       </w:pPr>
-      <w:bookmarkStart w:id="2" w:name="_Toc238901159"/>
+      <w:bookmarkStart w:id="2" w:name="_Toc244018357"/>
       <w:r>
         <w:t>1 Language independence</w:t>
       </w:r>
@@ -5461,7 +5451,7 @@
       <w:pPr>
         <w:pStyle w:val="10"/>
       </w:pPr>
-      <w:bookmarkStart w:id="3" w:name="_Toc238901160"/>
+      <w:bookmarkStart w:id="3" w:name="_Toc244018358"/>
       <w:r>
         <w:t>2 Introduction</w:t>
       </w:r>
@@ -5471,7 +5461,7 @@
       <w:pPr>
         <w:pStyle w:val="20"/>
       </w:pPr>
-      <w:bookmarkStart w:id="4" w:name="_Toc238901161"/>
+      <w:bookmarkStart w:id="4" w:name="_Toc244018359"/>
       <w:r>
         <w:t>2.1 Scope</w:t>
       </w:r>
@@ -5496,7 +5486,7 @@
       <w:pPr>
         <w:pStyle w:val="20"/>
       </w:pPr>
-      <w:bookmarkStart w:id="5" w:name="_Toc238901162"/>
+      <w:bookmarkStart w:id="5" w:name="_Toc244018360"/>
       <w:r>
         <w:t>2.2 Normative language</w:t>
       </w:r>
@@ -5504,14 +5494,14 @@
     </w:p>
     <w:p>
       <w:r>
-        <w:t>The key words "MUST", "MUST NOT", "SHOULD", "SHOULD NOT", and "MAY", when shown in uppercase, indicate normative requirements. Examples, notes, command lines, and file trees are informative unless expressly stated otherwise.</w:t>
+        <w:t>The key words "MUST", "MUST NOT", "SHOULD", "SHOULD NOT", and "MAY", when they appear in uppercase, are interpreted as described in RFC 2119. "MUST" and "MUST NOT" express requirements indispensable to artefact conformance or interoperability. "SHOULD" and "SHOULD NOT" express recommended courses for which a conforming implementation can use another documented course when justified. "MAY" expresses a permitted option. Other requirement language is descriptive.</w:t>
       </w:r>
     </w:p>
     <w:p>
       <w:pPr>
         <w:pStyle w:val="20"/>
       </w:pPr>
-      <w:bookmarkStart w:id="6" w:name="_Toc238901163"/>
+      <w:bookmarkStart w:id="6" w:name="_Toc244018361"/>
       <w:r>
         <w:t>2.3 Relationship to the other Parts</w:t>
       </w:r>
@@ -5519,117 +5509,128 @@
     </w:p>
     <w:p>
       <w:r>
-        <w:t xml:space="preserve">The XBRL GL Next Requirements Specification provides the background, design objectives, and requirements for the Framework. </w:t>
+        <w:t>The XBRL GL Next Requirements Specification provides the background, design objectives, and requirements for the Framework.</w:t>
       </w:r>
     </w:p>
     <w:p>
       <w:r>
-        <w:t xml:space="preserve">Part 1 defines the </w:t>
+        <w:t>The XBRL GL Next Taxonomy Framework consists of the following Parts:</w:t>
+      </w:r>
+    </w:p>
+    <w:p>
+      <w:pPr>
+        <w:pStyle w:val="af0"/>
+        <w:numPr>
+          <w:ilvl w:val="0"/>
+          <w:numId w:val="50"/>
+        </w:numPr>
+      </w:pPr>
+      <w:r>
+        <w:t>XBRL GL Next Taxonomy Framework — Part 1: General rules;</w:t>
+      </w:r>
+    </w:p>
+    <w:p>
+      <w:pPr>
+        <w:pStyle w:val="af0"/>
+        <w:numPr>
+          <w:ilvl w:val="0"/>
+          <w:numId w:val="50"/>
+        </w:numPr>
+      </w:pPr>
+      <w:r>
+        <w:t>XBRL GL Next Taxonomy Framework — Part 2: Tuple palette taxonomy;</w:t>
+      </w:r>
+    </w:p>
+    <w:p>
+      <w:pPr>
+        <w:pStyle w:val="af0"/>
+        <w:numPr>
+          <w:ilvl w:val="0"/>
+          <w:numId w:val="50"/>
+        </w:numPr>
+      </w:pPr>
+      <w:r>
+        <w:t>XBRL GL Next Taxonomy Framework — Part 3: OIM palette taxonomy;</w:t>
+      </w:r>
+    </w:p>
+    <w:p>
+      <w:pPr>
+        <w:pStyle w:val="af0"/>
+        <w:numPr>
+          <w:ilvl w:val="0"/>
+          <w:numId w:val="50"/>
+        </w:numPr>
+      </w:pPr>
+      <w:r>
+        <w:t>XBRL GL Next Taxonomy Framework — Part 4: Aligned Pool and extension governance;</w:t>
+      </w:r>
+    </w:p>
+    <w:p>
+      <w:pPr>
+        <w:pStyle w:val="af0"/>
+        <w:numPr>
+          <w:ilvl w:val="0"/>
+          <w:numId w:val="50"/>
+        </w:numPr>
+      </w:pPr>
+      <w:r>
+        <w:t>XBRL GL Next Taxonomy Framework — Part 5: Tavi palette taxonomy.</w:t>
+      </w:r>
+    </w:p>
+    <w:p>
+      <w:r>
+        <w:t>Part 1 defines the serialisation-independent semantic pipeline and the formal HMD contract. Part 2 defines the XBRL 2.1 Tuple realisation generated from formal HMDs. This Part 3 defines the OIM realisation generated from the same HMDs. Part 4 governs extension classification, registration, alignment and publication. Part 5 defines purpose-specific HMD views and their Tavi taxonomy and Table Template realisation.</w:t>
+      </w:r>
+    </w:p>
+    <w:p>
+      <w:r>
+        <w:t>This Part 3 specifies how formal HMDs are realised as OIM taxonomies, including primary items, dimensions, hypercubes, occurrence identification, and the corresponding taxonomy generation requirements.</w:t>
+      </w:r>
+    </w:p>
+    <w:p>
+      <w:r>
+        <w:t>Parts 2, 3 and 5 provide alternative taxonomy realisations of the common semantic framework established by Part 1, under the extension governance defined in Part 4. Each HMD serves as a purpose-specific palette, selecting reusable semantics from COR, BTX and AAA, which constitute the semantic paint boxes.</w:t>
+      </w:r>
+    </w:p>
+    <w:p>
+      <w:pPr>
+        <w:pStyle w:val="20"/>
+      </w:pPr>
+      <w:bookmarkStart w:id="7" w:name="_Toc244018362"/>
+      <w:r>
+        <w:t>2.4 Implementation independence</w:t>
+      </w:r>
+      <w:bookmarkEnd w:id="7"/>
+    </w:p>
+    <w:p>
+      <w:r>
+        <w:t>The requirements in this Part define observable inputs, validation outcomes, generated taxonomy components, and deterministic relationships among them. The sole maintained reference Generator authority is `tools/taxonomy/xBRLGL_TaxonomyGenerator.py`. The Generator and its supporting modules provide datatype mapping/override, EE1 Value Domain, selector-effective multiplicity, occurrence-dimension, Tuple/OIM, manifest, and deterministic-generation processing. `tools/taxonomy/datatype_binding.py` is a required runtime dependency;</w:t>
+      </w:r>
+    </w:p>
+    <w:p/>
+    <w:p>
+      <w:pPr>
+        <w:pStyle w:val="10"/>
+      </w:pPr>
+      <w:bookmarkStart w:id="8" w:name="_Toc244018363"/>
+      <w:r>
+        <w:t>3 Terms and definitions</w:t>
+      </w:r>
+      <w:bookmarkEnd w:id="8"/>
+    </w:p>
+    <w:p>
+      <w:r>
+        <w:t>For the purposes of this document, the terms and definitions given in</w:t>
       </w:r>
       <w:r>
         <w:rPr>
           <w:b/>
           <w:bCs/>
         </w:rPr>
-        <w:t>HMD for taxonomy</w:t>
-      </w:r>
-      <w:r>
-        <w:t xml:space="preserve"> input set and the common processing boundary. Part 2 defines the XBRL 2.1 Tuple realisation of that set. This Part 3 defines the OIM realisation generated from the same set. Part 4 governs extension sources and reusable Aligned definitions.</w:t>
-      </w:r>
-    </w:p>
-    <w:p>
-      <w:pPr>
-        <w:pStyle w:val="af0"/>
-        <w:numPr>
-          <w:ilvl w:val="0"/>
-          <w:numId w:val="43"/>
-        </w:numPr>
-      </w:pPr>
-      <w:r>
-        <w:t>XBRL GL Next Taxonomy Framework — Part 1: General rules;</w:t>
-      </w:r>
-    </w:p>
-    <w:p>
-      <w:pPr>
-        <w:pStyle w:val="af0"/>
-        <w:numPr>
-          <w:ilvl w:val="0"/>
-          <w:numId w:val="43"/>
-        </w:numPr>
-      </w:pPr>
-      <w:r>
-        <w:t>XBRL GL Next Taxonomy Framework — Part 2: Tuple palette taxonomy;</w:t>
-      </w:r>
-    </w:p>
-    <w:p>
-      <w:pPr>
-        <w:pStyle w:val="af0"/>
-        <w:numPr>
-          <w:ilvl w:val="0"/>
-          <w:numId w:val="43"/>
-        </w:numPr>
-      </w:pPr>
-      <w:r>
-        <w:t>XBRL GL Next Taxonomy Framework — Part 3: OIM palette taxonomy.</w:t>
-      </w:r>
-    </w:p>
-    <w:p>
-      <w:pPr>
-        <w:pStyle w:val="af0"/>
-        <w:numPr>
-          <w:ilvl w:val="0"/>
-          <w:numId w:val="43"/>
-        </w:numPr>
-      </w:pPr>
-      <w:r>
-        <w:t>XBRL GL Next Taxonomy Framework — Part 4: Aligned Pool and extension governance.</w:t>
-      </w:r>
-    </w:p>
-    <w:p>
-      <w:pPr>
-        <w:pStyle w:val="20"/>
-      </w:pPr>
-      <w:bookmarkStart w:id="7" w:name="_Toc238901164"/>
-      <w:r>
-        <w:t>2.4 Implementation independence</w:t>
-      </w:r>
-      <w:bookmarkEnd w:id="7"/>
-    </w:p>
-    <w:p>
-      <w:r>
-        <w:t xml:space="preserve">The requirements in this Part define observable inputs, validation outcomes, generated taxonomy components, and deterministic relationships among them. The sole maintained reference Generator authority is `src/taxonomy/xBRLGL_TaxonomyGenerator.py`. The Generator contains the normative datatype mapping/override, EE1 </w:t>
-      </w:r>
-      <w:r>
-        <w:rPr>
-          <w:b/>
-          <w:bCs/>
-        </w:rPr>
-        <w:t>Value Domain</w:t>
-      </w:r>
-      <w:r>
-        <w:t xml:space="preserve">, selector-effective multiplicity, occurrence-dimension, Tuple/OIM, manifest, and deterministic-generation processing and </w:t>
-      </w:r>
-      <w:r>
-        <w:t>MUST</w:t>
-      </w:r>
-      <w:r>
-        <w:t xml:space="preserve"> NOT import `tools/**`. Helper programs under `tools/taxonomy/` are optional evaluation tools only.</w:t>
-      </w:r>
-    </w:p>
-    <w:p/>
-    <w:p>
-      <w:pPr>
-        <w:pStyle w:val="10"/>
-      </w:pPr>
-      <w:bookmarkStart w:id="8" w:name="_Toc238901165"/>
-      <w:r>
-        <w:t>3 Terms and definitions</w:t>
-      </w:r>
-      <w:bookmarkEnd w:id="8"/>
-    </w:p>
-    <w:p>
-      <w:r>
-        <w:t>For the purposes of this document, the terms and definitions given in Part 1 and the following apply. Unless otherwise specified, these terms constitute the common terminology used in this Part and the other Parts of the XBRL GL Next Taxonomy Framework.</w:t>
+        <w:t xml:space="preserve"> Part 1</w:t>
+      </w:r>
+      <w:r>
+        <w:t xml:space="preserve"> and the following apply. Unless otherwise specified, these terms constitute the common terminology used in this Part and the other Parts of the XBRL GL Next Taxonomy Framework.</w:t>
       </w:r>
     </w:p>
     <w:p>
@@ -6102,7 +6103,7 @@
       <w:pPr>
         <w:pStyle w:val="10"/>
       </w:pPr>
-      <w:bookmarkStart w:id="9" w:name="_Toc238901166"/>
+      <w:bookmarkStart w:id="9" w:name="_Toc244018364"/>
       <w:r>
         <w:t>4 Authoritative input and validation contract</w:t>
       </w:r>
@@ -6112,7 +6113,7 @@
       <w:pPr>
         <w:pStyle w:val="20"/>
       </w:pPr>
-      <w:bookmarkStart w:id="10" w:name="_Toc238901167"/>
+      <w:bookmarkStart w:id="10" w:name="_Toc244018365"/>
       <w:r>
         <w:t>4.1 Input authority</w:t>
       </w:r>
@@ -6162,7 +6163,7 @@
       <w:pPr>
         <w:pStyle w:val="20"/>
       </w:pPr>
-      <w:bookmarkStart w:id="11" w:name="_Toc238901168"/>
+      <w:bookmarkStart w:id="11" w:name="_Toc244018366"/>
       <w:r>
         <w:t>4.2 Required 18-column order</w:t>
       </w:r>
@@ -6206,7 +6207,7 @@
       <w:pPr>
         <w:pStyle w:val="20"/>
       </w:pPr>
-      <w:bookmarkStart w:id="12" w:name="_Toc238901169"/>
+      <w:bookmarkStart w:id="12" w:name="_Toc244018367"/>
       <w:r>
         <w:t>4.3 XPath and QName authority</w:t>
       </w:r>
@@ -6239,10 +6240,10 @@
         <w:tblLook w:val="04A0" w:firstRow="1" w:lastRow="0" w:firstColumn="1" w:lastColumn="0" w:noHBand="0" w:noVBand="1"/>
       </w:tblPr>
       <w:tblGrid>
-        <w:gridCol w:w="1981"/>
-        <w:gridCol w:w="850"/>
-        <w:gridCol w:w="2126"/>
-        <w:gridCol w:w="2409"/>
+        <w:gridCol w:w="1980"/>
+        <w:gridCol w:w="851"/>
+        <w:gridCol w:w="1984"/>
+        <w:gridCol w:w="2551"/>
         <w:gridCol w:w="2370"/>
       </w:tblGrid>
       <w:tr>
@@ -6285,7 +6286,7 @@
         </w:tc>
         <w:tc>
           <w:tcPr>
-            <w:tcW w:w="436" w:type="pct"/>
+            <w:tcW w:w="437" w:type="pct"/>
             <w:shd w:val="clear" w:color="auto" w:fill="F2F2F2" w:themeFill="background1" w:themeFillShade="F2"/>
             <w:tcMar>
               <w:top w:w="0" w:type="dxa"/>
@@ -6318,7 +6319,7 @@
         </w:tc>
         <w:tc>
           <w:tcPr>
-            <w:tcW w:w="1092" w:type="pct"/>
+            <w:tcW w:w="1019" w:type="pct"/>
             <w:shd w:val="clear" w:color="auto" w:fill="F2F2F2" w:themeFill="background1" w:themeFillShade="F2"/>
             <w:tcMar>
               <w:top w:w="0" w:type="dxa"/>
@@ -6351,7 +6352,7 @@
         </w:tc>
         <w:tc>
           <w:tcPr>
-            <w:tcW w:w="1237" w:type="pct"/>
+            <w:tcW w:w="1310" w:type="pct"/>
             <w:shd w:val="clear" w:color="auto" w:fill="F2F2F2" w:themeFill="background1" w:themeFillShade="F2"/>
             <w:tcMar>
               <w:top w:w="0" w:type="dxa"/>
@@ -6452,7 +6453,7 @@
         </w:tc>
         <w:tc>
           <w:tcPr>
-            <w:tcW w:w="436" w:type="pct"/>
+            <w:tcW w:w="437" w:type="pct"/>
             <w:tcMar>
               <w:top w:w="0" w:type="dxa"/>
               <w:left w:w="28" w:type="dxa"/>
@@ -6483,7 +6484,7 @@
         </w:tc>
         <w:tc>
           <w:tcPr>
-            <w:tcW w:w="1092" w:type="pct"/>
+            <w:tcW w:w="1019" w:type="pct"/>
             <w:tcMar>
               <w:top w:w="0" w:type="dxa"/>
               <w:left w:w="28" w:type="dxa"/>
@@ -6513,7 +6514,7 @@
         </w:tc>
         <w:tc>
           <w:tcPr>
-            <w:tcW w:w="1237" w:type="pct"/>
+            <w:tcW w:w="1310" w:type="pct"/>
             <w:tcMar>
               <w:top w:w="0" w:type="dxa"/>
               <w:left w:w="28" w:type="dxa"/>
@@ -6608,7 +6609,7 @@
         </w:tc>
         <w:tc>
           <w:tcPr>
-            <w:tcW w:w="436" w:type="pct"/>
+            <w:tcW w:w="437" w:type="pct"/>
             <w:tcMar>
               <w:top w:w="0" w:type="dxa"/>
               <w:left w:w="28" w:type="dxa"/>
@@ -6639,7 +6640,7 @@
         </w:tc>
         <w:tc>
           <w:tcPr>
-            <w:tcW w:w="1092" w:type="pct"/>
+            <w:tcW w:w="1019" w:type="pct"/>
             <w:tcMar>
               <w:top w:w="0" w:type="dxa"/>
               <w:left w:w="28" w:type="dxa"/>
@@ -6669,7 +6670,7 @@
         </w:tc>
         <w:tc>
           <w:tcPr>
-            <w:tcW w:w="1237" w:type="pct"/>
+            <w:tcW w:w="1310" w:type="pct"/>
             <w:tcMar>
               <w:top w:w="0" w:type="dxa"/>
               <w:left w:w="28" w:type="dxa"/>
@@ -6733,7 +6734,7 @@
       <w:pPr>
         <w:pStyle w:val="20"/>
       </w:pPr>
-      <w:bookmarkStart w:id="13" w:name="_Toc238901170"/>
+      <w:bookmarkStart w:id="13" w:name="_Toc244018368"/>
       <w:r>
         <w:t>4.4 Row validation</w:t>
       </w:r>
@@ -6878,7 +6879,7 @@
       <w:pPr>
         <w:pStyle w:val="20"/>
       </w:pPr>
-      <w:bookmarkStart w:id="14" w:name="_Toc238901171"/>
+      <w:bookmarkStart w:id="14" w:name="_Toc244018369"/>
       <w:r>
         <w:t>4.5 Non-use subtrees</w:t>
       </w:r>
@@ -6903,7 +6904,7 @@
       <w:pPr>
         <w:pStyle w:val="20"/>
       </w:pPr>
-      <w:bookmarkStart w:id="15" w:name="_Toc238901172"/>
+      <w:bookmarkStart w:id="15" w:name="_Toc244018370"/>
       <w:r>
         <w:t>4.6 Cross-HMD shared declarations</w:t>
       </w:r>
@@ -6933,7 +6934,7 @@
       <w:pPr>
         <w:pStyle w:val="10"/>
       </w:pPr>
-      <w:bookmarkStart w:id="16" w:name="_Toc238901173"/>
+      <w:bookmarkStart w:id="16" w:name="_Toc244018371"/>
       <w:r>
         <w:t>5 OIM binding model</w:t>
       </w:r>
@@ -6943,7 +6944,7 @@
       <w:pPr>
         <w:pStyle w:val="20"/>
       </w:pPr>
-      <w:bookmarkStart w:id="17" w:name="_Toc238901174"/>
+      <w:bookmarkStart w:id="17" w:name="_Toc244018372"/>
       <w:r>
         <w:t>5.1 Attribute facts</w:t>
       </w:r>
@@ -6978,7 +6979,7 @@
       <w:pPr>
         <w:pStyle w:val="20"/>
       </w:pPr>
-      <w:bookmarkStart w:id="18" w:name="_Toc238901175"/>
+      <w:bookmarkStart w:id="18" w:name="_Toc244018373"/>
       <w:r>
         <w:t>5.2 Structural rows</w:t>
       </w:r>
@@ -7021,7 +7022,7 @@
       <w:pPr>
         <w:pStyle w:val="20"/>
       </w:pPr>
-      <w:bookmarkStart w:id="19" w:name="_Toc238901176"/>
+      <w:bookmarkStart w:id="19" w:name="_Toc244018374"/>
       <w:r>
         <w:t>5.3 Class resources</w:t>
       </w:r>
@@ -7534,7 +7535,7 @@
       <w:pPr>
         <w:pStyle w:val="20"/>
       </w:pPr>
-      <w:bookmarkStart w:id="20" w:name="_Toc238901177"/>
+      <w:bookmarkStart w:id="20" w:name="_Toc244018375"/>
       <w:r>
         <w:t>5.4 Extended roles</w:t>
       </w:r>
@@ -7557,7 +7558,7 @@
       <w:pPr>
         <w:pStyle w:val="10"/>
       </w:pPr>
-      <w:bookmarkStart w:id="21" w:name="_Toc238901178"/>
+      <w:bookmarkStart w:id="21" w:name="_Toc244018376"/>
       <w:r>
         <w:t>6 Dimensional network generation</w:t>
       </w:r>
@@ -7567,7 +7568,7 @@
       <w:pPr>
         <w:pStyle w:val="20"/>
       </w:pPr>
-      <w:bookmarkStart w:id="22" w:name="_Toc238901179"/>
+      <w:bookmarkStart w:id="22" w:name="_Toc244018377"/>
       <w:r>
         <w:t>6.1 Closed cube</w:t>
       </w:r>
@@ -7626,7 +7627,7 @@
       <w:pPr>
         <w:pStyle w:val="20"/>
       </w:pPr>
-      <w:bookmarkStart w:id="23" w:name="_Toc238901180"/>
+      <w:bookmarkStart w:id="23" w:name="_Toc244018378"/>
       <w:r>
         <w:t>6.2 Occurrence dimensions</w:t>
       </w:r>
@@ -7671,7 +7672,7 @@
       <w:pPr>
         <w:pStyle w:val="20"/>
       </w:pPr>
-      <w:bookmarkStart w:id="24" w:name="_Toc238901181"/>
+      <w:bookmarkStart w:id="24" w:name="_Toc244018379"/>
       <w:r>
         <w:t>6.3 Attribute membership</w:t>
       </w:r>
@@ -7702,7 +7703,7 @@
       <w:pPr>
         <w:pStyle w:val="20"/>
       </w:pPr>
-      <w:bookmarkStart w:id="25" w:name="_Toc238901182"/>
+      <w:bookmarkStart w:id="25" w:name="_Toc244018380"/>
       <w:r>
         <w:t>6.4 Descendant Classes and targetRole</w:t>
       </w:r>
@@ -7735,7 +7736,7 @@
       <w:pPr>
         <w:pStyle w:val="20"/>
       </w:pPr>
-      <w:bookmarkStart w:id="26" w:name="_Toc238901183"/>
+      <w:bookmarkStart w:id="26" w:name="_Toc244018381"/>
       <w:r>
         <w:t>6.5 Reading the dimensional hierarchy</w:t>
       </w:r>
@@ -8261,7 +8262,7 @@
       <w:pPr>
         <w:pStyle w:val="20"/>
       </w:pPr>
-      <w:bookmarkStart w:id="27" w:name="_Toc238901184"/>
+      <w:bookmarkStart w:id="27" w:name="_Toc244018382"/>
       <w:r>
         <w:t>6.6 Multiplicity</w:t>
       </w:r>
@@ -8286,7 +8287,7 @@
       <w:pPr>
         <w:pStyle w:val="20"/>
       </w:pPr>
-      <w:bookmarkStart w:id="28" w:name="_Toc238901185"/>
+      <w:bookmarkStart w:id="28" w:name="_Toc244018383"/>
       <w:r>
         <w:t>6.7 Occurrence-key alignment example</w:t>
       </w:r>
@@ -8511,7 +8512,7 @@
       <w:pPr>
         <w:pStyle w:val="10"/>
       </w:pPr>
-      <w:bookmarkStart w:id="29" w:name="_Toc238901186"/>
+      <w:bookmarkStart w:id="29" w:name="_Toc244018384"/>
       <w:r>
         <w:t>7 OIM taxonomy artefacts</w:t>
       </w:r>
@@ -8521,7 +8522,7 @@
       <w:pPr>
         <w:pStyle w:val="20"/>
       </w:pPr>
-      <w:bookmarkStart w:id="30" w:name="_Toc238901187"/>
+      <w:bookmarkStart w:id="30" w:name="_Toc244018385"/>
       <w:r>
         <w:t>7.1 OIM module schema</w:t>
       </w:r>
@@ -8562,7 +8563,7 @@
       <w:pPr>
         <w:pStyle w:val="20"/>
       </w:pPr>
-      <w:bookmarkStart w:id="31" w:name="_Toc238901188"/>
+      <w:bookmarkStart w:id="31" w:name="_Toc244018386"/>
       <w:r>
         <w:t>7.2 OIM labels</w:t>
       </w:r>
@@ -8585,7 +8586,7 @@
       <w:pPr>
         <w:pStyle w:val="20"/>
       </w:pPr>
-      <w:bookmarkStart w:id="32" w:name="_Toc238901189"/>
+      <w:bookmarkStart w:id="32" w:name="_Toc244018387"/>
       <w:r>
         <w:t>7.3 OIM module presentation linkbase</w:t>
       </w:r>
@@ -8621,7 +8622,7 @@
       <w:pPr>
         <w:pStyle w:val="20"/>
       </w:pPr>
-      <w:bookmarkStart w:id="33" w:name="_Toc238901190"/>
+      <w:bookmarkStart w:id="33" w:name="_Toc244018388"/>
       <w:r>
         <w:t>7.4 OIM Presentation Linkbase Set</w:t>
       </w:r>
@@ -8691,7 +8692,7 @@
       <w:pPr>
         <w:pStyle w:val="20"/>
       </w:pPr>
-      <w:bookmarkStart w:id="34" w:name="_Toc238901191"/>
+      <w:bookmarkStart w:id="34" w:name="_Toc244018389"/>
       <w:r>
         <w:t>7.5 OIM message entry point and DTS separation</w:t>
       </w:r>
@@ -8761,7 +8762,7 @@
       <w:pPr>
         <w:pStyle w:val="20"/>
       </w:pPr>
-      <w:bookmarkStart w:id="35" w:name="_Toc238901192"/>
+      <w:bookmarkStart w:id="35" w:name="_Toc244018390"/>
       <w:r>
         <w:t>7.6 Dimensional definition linkbase</w:t>
       </w:r>
@@ -8776,7 +8777,7 @@
       <w:pPr>
         <w:pStyle w:val="20"/>
       </w:pPr>
-      <w:bookmarkStart w:id="36" w:name="_Toc238901193"/>
+      <w:bookmarkStart w:id="36" w:name="_Toc244018391"/>
       <w:r>
         <w:t>7.7 Linkroles and DTS discovery</w:t>
       </w:r>
@@ -8819,7 +8820,7 @@
       <w:pPr>
         <w:pStyle w:val="10"/>
       </w:pPr>
-      <w:bookmarkStart w:id="37" w:name="_Toc238901194"/>
+      <w:bookmarkStart w:id="37" w:name="_Toc244018392"/>
       <w:r>
         <w:t>8 xBRL-CSV metadata and data tables</w:t>
       </w:r>
@@ -8829,7 +8830,7 @@
       <w:pPr>
         <w:pStyle w:val="20"/>
       </w:pPr>
-      <w:bookmarkStart w:id="38" w:name="_Toc238901195"/>
+      <w:bookmarkStart w:id="38" w:name="_Toc244018393"/>
       <w:r>
         <w:t>8.1 Separation from taxonomy generation</w:t>
       </w:r>
@@ -8864,7 +8865,7 @@
       <w:pPr>
         <w:pStyle w:val="20"/>
       </w:pPr>
-      <w:bookmarkStart w:id="39" w:name="_Toc238901196"/>
+      <w:bookmarkStart w:id="39" w:name="_Toc244018394"/>
       <w:r>
         <w:t>8.2 documentInfo</w:t>
       </w:r>
@@ -9094,7 +9095,7 @@
       <w:pPr>
         <w:pStyle w:val="20"/>
       </w:pPr>
-      <w:bookmarkStart w:id="40" w:name="_Toc238901197"/>
+      <w:bookmarkStart w:id="40" w:name="_Toc244018395"/>
       <w:r>
         <w:t>8.3 Occurrence-key columns</w:t>
       </w:r>
@@ -9137,7 +9138,7 @@
       <w:pPr>
         <w:pStyle w:val="20"/>
       </w:pPr>
-      <w:bookmarkStart w:id="41" w:name="_Toc238901198"/>
+      <w:bookmarkStart w:id="41" w:name="_Toc244018396"/>
       <w:r>
         <w:t>8.4 Property columns</w:t>
       </w:r>
@@ -9172,7 +9173,7 @@
       <w:pPr>
         <w:pStyle w:val="20"/>
       </w:pPr>
-      <w:bookmarkStart w:id="42" w:name="_Toc238901199"/>
+      <w:bookmarkStart w:id="42" w:name="_Toc244018397"/>
       <w:r>
         <w:t>8.5 One Structured CSV per report</w:t>
       </w:r>
@@ -9205,7 +9206,7 @@
       <w:pPr>
         <w:pStyle w:val="20"/>
       </w:pPr>
-      <w:bookmarkStart w:id="43" w:name="_Toc238901200"/>
+      <w:bookmarkStart w:id="43" w:name="_Toc244018398"/>
       <w:r>
         <w:t>8.6 Reading a Structured CSV row through the cube</w:t>
       </w:r>
@@ -9220,7 +9221,7 @@
       <w:pPr>
         <w:pStyle w:val="20"/>
       </w:pPr>
-      <w:bookmarkStart w:id="44" w:name="_Toc238901201"/>
+      <w:bookmarkStart w:id="44" w:name="_Toc244018399"/>
       <w:r>
         <w:t>8.7 Report validation</w:t>
       </w:r>
@@ -9235,7 +9236,7 @@
       <w:pPr>
         <w:pStyle w:val="20"/>
       </w:pPr>
-      <w:bookmarkStart w:id="45" w:name="_Toc238901202"/>
+      <w:bookmarkStart w:id="45" w:name="_Toc244018400"/>
       <w:r>
         <w:t>8.8 Shared `gen` module, Value Domains, and Structured CSV</w:t>
       </w:r>
@@ -9471,7 +9472,7 @@
       <w:pPr>
         <w:pStyle w:val="20"/>
       </w:pPr>
-      <w:bookmarkStart w:id="46" w:name="_Toc238901203"/>
+      <w:bookmarkStart w:id="46" w:name="_Toc244018401"/>
       <w:r>
         <w:t>8.9 Implemented occurrence and Value Domain rules</w:t>
       </w:r>
@@ -9584,7 +9585,7 @@
       <w:pPr>
         <w:pStyle w:val="10"/>
       </w:pPr>
-      <w:bookmarkStart w:id="47" w:name="_Toc238901204"/>
+      <w:bookmarkStart w:id="47" w:name="_Toc244018402"/>
       <w:r>
         <w:t>9 Cross-binding equivalence</w:t>
       </w:r>
@@ -10153,7 +10154,7 @@
       <w:pPr>
         <w:pStyle w:val="10"/>
       </w:pPr>
-      <w:bookmarkStart w:id="48" w:name="_Toc238901205"/>
+      <w:bookmarkStart w:id="48" w:name="_Toc244018403"/>
       <w:r>
         <w:t>10 accountingEntries baseline and businessTransactions additional HMD</w:t>
       </w:r>
@@ -10255,7 +10256,7 @@
       <w:pPr>
         <w:pStyle w:val="10"/>
       </w:pPr>
-      <w:bookmarkStart w:id="49" w:name="_Toc238901206"/>
+      <w:bookmarkStart w:id="49" w:name="_Toc244018404"/>
       <w:r>
         <w:t>11 Formal package assembly</w:t>
       </w:r>
@@ -10265,7 +10266,7 @@
       <w:pPr>
         <w:pStyle w:val="20"/>
       </w:pPr>
-      <w:bookmarkStart w:id="50" w:name="_Toc238901207"/>
+      <w:bookmarkStart w:id="50" w:name="_Toc244018405"/>
       <w:r>
         <w:t>11.</w:t>
       </w:r>
@@ -11010,7 +11011,7 @@
       <w:pPr>
         <w:pStyle w:val="20"/>
       </w:pPr>
-      <w:bookmarkStart w:id="51" w:name="_Toc238901208"/>
+      <w:bookmarkStart w:id="51" w:name="_Toc244018406"/>
       <w:r>
         <w:t>11.</w:t>
       </w:r>
@@ -11034,7 +11035,7 @@
       <w:pPr>
         <w:pStyle w:val="20"/>
       </w:pPr>
-      <w:bookmarkStart w:id="52" w:name="_Toc238901209"/>
+      <w:bookmarkStart w:id="52" w:name="_Toc244018407"/>
       <w:r>
         <w:t>11.</w:t>
       </w:r>
@@ -11068,7 +11069,7 @@
       <w:pPr>
         <w:pStyle w:val="20"/>
       </w:pPr>
-      <w:bookmarkStart w:id="53" w:name="_Toc238901210"/>
+      <w:bookmarkStart w:id="53" w:name="_Toc244018408"/>
       <w:r>
         <w:t>11.4 All-or-nothing publication</w:t>
       </w:r>
@@ -11113,7 +11114,7 @@
       <w:pPr>
         <w:pStyle w:val="10"/>
       </w:pPr>
-      <w:bookmarkStart w:id="54" w:name="_Toc238901211"/>
+      <w:bookmarkStart w:id="54" w:name="_Toc244018409"/>
       <w:r>
         <w:t>12 Validation and conformance</w:t>
       </w:r>
@@ -11123,7 +11124,7 @@
       <w:pPr>
         <w:pStyle w:val="20"/>
       </w:pPr>
-      <w:bookmarkStart w:id="55" w:name="_Toc238901212"/>
+      <w:bookmarkStart w:id="55" w:name="_Toc244018410"/>
       <w:r>
         <w:t>12.1 Taxonomy conformance</w:t>
       </w:r>
@@ -11293,7 +11294,7 @@
       <w:pPr>
         <w:pStyle w:val="20"/>
       </w:pPr>
-      <w:bookmarkStart w:id="56" w:name="_Toc238901213"/>
+      <w:bookmarkStart w:id="56" w:name="_Toc244018411"/>
       <w:r>
         <w:t>12.2 Minimum report tests</w:t>
       </w:r>
@@ -11440,7 +11441,7 @@
       <w:pPr>
         <w:pStyle w:val="10"/>
       </w:pPr>
-      <w:bookmarkStart w:id="57" w:name="_Toc238901214"/>
+      <w:bookmarkStart w:id="57" w:name="_Toc244018412"/>
       <w:r>
         <w:rPr>
           <w:rFonts w:hint="eastAsia"/>
@@ -11946,7 +11947,7 @@
       <w:pPr>
         <w:pStyle w:val="10"/>
       </w:pPr>
-      <w:bookmarkStart w:id="58" w:name="_Toc238901215"/>
+      <w:bookmarkStart w:id="58" w:name="_Toc244018413"/>
       <w:r>
         <w:t>14 xBRL-CSV instance examples (informative)</w:t>
       </w:r>
@@ -11956,7 +11957,7 @@
       <w:pPr>
         <w:pStyle w:val="20"/>
       </w:pPr>
-      <w:bookmarkStart w:id="59" w:name="_Toc238901216"/>
+      <w:bookmarkStart w:id="59" w:name="_Toc244018414"/>
       <w:r>
         <w:t>14.1 Example files</w:t>
       </w:r>
@@ -12315,7 +12316,7 @@
       <w:pPr>
         <w:pStyle w:val="20"/>
       </w:pPr>
-      <w:bookmarkStart w:id="60" w:name="_Toc238901217"/>
+      <w:bookmarkStart w:id="60" w:name="_Toc244018415"/>
       <w:r>
         <w:t>14.2 Accounting Entries example</w:t>
       </w:r>
@@ -17016,7 +17017,7 @@
       <w:pPr>
         <w:pStyle w:val="20"/>
       </w:pPr>
-      <w:bookmarkStart w:id="61" w:name="_Toc238901218"/>
+      <w:bookmarkStart w:id="61" w:name="_Toc244018416"/>
       <w:r>
         <w:t>14.3 Business Transactions example</w:t>
       </w:r>
@@ -23141,7 +23142,7 @@
       <w:pPr>
         <w:pStyle w:val="20"/>
       </w:pPr>
-      <w:bookmarkStart w:id="62" w:name="_Toc238901219"/>
+      <w:bookmarkStart w:id="62" w:name="_Toc244018417"/>
       <w:r>
         <w:t>14.4 Concepts, dimensions, and presentation</w:t>
       </w:r>
@@ -23176,7 +23177,7 @@
       <w:pPr>
         <w:pStyle w:val="20"/>
       </w:pPr>
-      <w:bookmarkStart w:id="63" w:name="_Toc238901220"/>
+      <w:bookmarkStart w:id="63" w:name="_Toc244018418"/>
       <w:r>
         <w:t>14.5 Unit handling</w:t>
       </w:r>
@@ -23196,7 +23197,7 @@
       <w:r>
         <w:br/>
       </w:r>
-      <w:bookmarkStart w:id="66" w:name="_Toc238901221"/>
+      <w:bookmarkStart w:id="66" w:name="_Toc244018419"/>
       <w:r>
         <w:t>References</w:t>
       </w:r>
@@ -24161,7 +24162,7 @@
       <w:r>
         <w:br/>
       </w:r>
-      <w:bookmarkStart w:id="67" w:name="_Toc238901222"/>
+      <w:bookmarkStart w:id="67" w:name="_Toc244018420"/>
       <w:r>
         <w:t>Intellectual property status</w:t>
       </w:r>
@@ -24169,7 +24170,7 @@
     </w:p>
     <w:p>
       <w:r>
-        <w:t>Copyright and license terms are under review. This draft is shared only with invited project participants through the private project repository. No permission for public redistribution or publication is granted by this draft notice.</w:t>
+        <w:t>Copyright and license terms are under review. This draft is made available through the public project repository for collaborative review. Publication of this draft does not establish additional redistribution or derivative-use rights.</w:t>
       </w:r>
     </w:p>
     <w:p>
@@ -24188,15 +24189,12 @@
       <w:pPr>
         <w:pStyle w:val="Appendix"/>
       </w:pPr>
-      <w:bookmarkStart w:id="68" w:name="_Toc238901223"/>
-      <w:r>
-        <w:rPr>
-          <w:rFonts w:hint="eastAsia"/>
-        </w:rPr>
-        <w:t>-</w:t>
-      </w:r>
-      <w:r>
-        <w:t xml:space="preserve"> Document history</w:t>
+      <w:bookmarkStart w:id="68" w:name="_Toc244018421"/>
+      <w:r>
+        <w:br/>
+      </w:r>
+      <w:r>
+        <w:t>Document history</w:t>
       </w:r>
       <w:bookmarkEnd w:id="68"/>
     </w:p>
@@ -25386,7 +25384,25 @@
                 <w:szCs w:val="32"/>
                 <w:lang w:val="en-GB"/>
               </w:rPr>
-              <w:t xml:space="preserve">v6: Aligned Part 3 with the accepted OIM package and report convention: common HMD-for-taxonomy input, &lt;P&gt;-all-oim/dim/pre filenames under oim/&lt;HMD&gt;, OIM-specific presentation extensions distinct from Tuple, no Tuple content-schema discovery, and one JSON metadata entry point plus one same-basename </w:t>
+              <w:t>v6: Aligned Part 3 with the accepted OIM package and report convention: common HMD-for-taxonomy input, &lt;P&gt;-all-oim/dim/pre filenames under oim/&lt;HMD&gt;, OIM-specific presentation extensions distinct from Tuple, no Tuple content-schema discovery, and one JSON metadata entry point plus one same-</w:t>
+            </w:r>
+            <w:proofErr w:type="spellStart"/>
+            <w:r>
+              <w:rPr>
+                <w:sz w:val="20"/>
+                <w:szCs w:val="32"/>
+                <w:lang w:val="en-GB"/>
+              </w:rPr>
+              <w:t>basename</w:t>
+            </w:r>
+            <w:proofErr w:type="spellEnd"/>
+            <w:r>
+              <w:rPr>
+                <w:sz w:val="20"/>
+                <w:szCs w:val="32"/>
+                <w:lang w:val="en-GB"/>
+              </w:rPr>
+              <w:t xml:space="preserve"> </w:t>
             </w:r>
             <w:r>
               <w:rPr>
@@ -25613,7 +25629,7 @@
         <w:br/>
       </w:r>
       <w:bookmarkStart w:id="70" w:name="_Toc237003862"/>
-      <w:bookmarkStart w:id="71" w:name="_Toc238901224"/>
+      <w:bookmarkStart w:id="71" w:name="_Toc244018422"/>
       <w:r>
         <w:t>Errata corrections in this document</w:t>
       </w:r>
@@ -25631,20 +25647,849 @@
         <w:t>No errata have been incorporated into this document.</w:t>
       </w:r>
     </w:p>
+    <w:p/>
     <w:p>
-      <w:pPr>
-        <w:spacing w:after="40"/>
+      <w:r>
+        <w:br w:type="page"/>
+      </w:r>
+    </w:p>
+    <w:p>
+      <w:pPr>
+        <w:pStyle w:val="Appendix"/>
+      </w:pPr>
+      <w:r>
+        <w:br/>
+      </w:r>
+      <w:bookmarkStart w:id="72" w:name="_Toc244018423"/>
+      <w:r>
+        <w:t>(informative)</w:t>
+      </w:r>
+      <w:r>
+        <w:br/>
+        <w:t>Correspondence with XBRL GL Next Requirements</w:t>
+      </w:r>
+      <w:bookmarkEnd w:id="72"/>
+      <w:r>
+        <w:t xml:space="preserve"> </w:t>
+      </w:r>
+    </w:p>
+    <w:p>
+      <w:r>
+        <w:t xml:space="preserve">Table </w:t>
+      </w:r>
+      <w:r>
         <w:rPr>
-          <w:rFonts w:ascii="Calibri" w:hAnsi="Calibri" w:cstheme="minorBidi"/>
+          <w:rFonts w:hint="eastAsia"/>
+        </w:rPr>
+        <w:t>E</w:t>
+      </w:r>
+      <w:r>
+        <w:t>.1 maps the applicable requirements of the XBRL GL Next Requirements Specification</w:t>
+      </w:r>
+      <w:r>
+        <w:rPr>
+          <w:rFonts w:hint="eastAsia"/>
+        </w:rPr>
+        <w:t xml:space="preserve"> </w:t>
+      </w:r>
+      <w:r>
+        <w:rPr>
+          <w:rFonts w:hint="eastAsia"/>
+        </w:rPr>
+        <w:t>t</w:t>
+      </w:r>
+      <w:r>
+        <w:t>o their implementation in this Part. The requirement identifiers and names are reproduced from that Specification. This correspondence is informative and does not create additional requirements or assert implementation conformance.</w:t>
+      </w:r>
+    </w:p>
+    <w:p>
+      <w:pPr>
+        <w:keepNext/>
+        <w:tabs>
+          <w:tab w:val="num" w:pos="360"/>
+          <w:tab w:val="left" w:pos="403"/>
+        </w:tabs>
+        <w:spacing w:line="240" w:lineRule="atLeast"/>
+        <w:ind w:left="720"/>
+        <w:contextualSpacing/>
+        <w:jc w:val="center"/>
+        <w:rPr>
+          <w:b/>
+        </w:rPr>
+      </w:pPr>
+      <w:r>
+        <w:rPr>
+          <w:b/>
           <w:lang w:eastAsia="en-US"/>
         </w:rPr>
-      </w:pPr>
+        <w:t>Table</w:t>
+      </w:r>
+      <w:r>
+        <w:rPr>
+          <w:rFonts w:hint="eastAsia"/>
+          <w:b/>
+        </w:rPr>
+        <w:t xml:space="preserve"> E</w:t>
+      </w:r>
+      <w:r>
+        <w:rPr>
+          <w:b/>
+          <w:lang w:eastAsia="en-US"/>
+        </w:rPr>
+        <w:t>.</w:t>
+      </w:r>
+      <w:r>
+        <w:rPr>
+          <w:b/>
+          <w:lang w:eastAsia="en-US"/>
+        </w:rPr>
+        <w:fldChar w:fldCharType="begin"/>
+      </w:r>
+      <w:r>
+        <w:rPr>
+          <w:b/>
+          <w:lang w:eastAsia="en-US"/>
+        </w:rPr>
+        <w:instrText xml:space="preserve"> SEQ Table \* ARABIC </w:instrText>
+      </w:r>
+      <w:r>
+        <w:rPr>
+          <w:b/>
+          <w:lang w:eastAsia="en-US"/>
+        </w:rPr>
+        <w:fldChar w:fldCharType="separate"/>
+      </w:r>
+      <w:r>
+        <w:rPr>
+          <w:b/>
+          <w:lang w:eastAsia="en-US"/>
+        </w:rPr>
+        <w:t>1</w:t>
+      </w:r>
+      <w:r>
+        <w:rPr>
+          <w:b/>
+          <w:lang w:eastAsia="en-US"/>
+        </w:rPr>
+        <w:fldChar w:fldCharType="end"/>
+      </w:r>
+      <w:r>
+        <w:rPr>
+          <w:b/>
+          <w:lang w:eastAsia="en-US"/>
+        </w:rPr>
+        <w:t xml:space="preserve"> ― Mapping of XBRL GL Next Requirements</w:t>
+      </w:r>
     </w:p>
-    <w:p>
-      <w:r>
-        <w:br w:type="page"/>
-      </w:r>
-    </w:p>
+    <w:tbl>
+      <w:tblPr>
+        <w:tblStyle w:val="af7"/>
+        <w:tblW w:w="0" w:type="auto"/>
+        <w:tblLook w:val="04A0" w:firstRow="1" w:lastRow="0" w:firstColumn="1" w:lastColumn="0" w:noHBand="0" w:noVBand="1"/>
+      </w:tblPr>
+      <w:tblGrid>
+        <w:gridCol w:w="1432"/>
+        <w:gridCol w:w="2568"/>
+        <w:gridCol w:w="5736"/>
+      </w:tblGrid>
+      <w:tr>
+        <w:trPr>
+          <w:cantSplit/>
+          <w:tblHeader/>
+        </w:trPr>
+        <w:tc>
+          <w:tcPr>
+            <w:tcW w:w="1413" w:type="dxa"/>
+            <w:shd w:val="clear" w:color="auto" w:fill="F2F2F2" w:themeFill="background1" w:themeFillShade="F2"/>
+            <w:vAlign w:val="center"/>
+          </w:tcPr>
+          <w:p>
+            <w:pPr>
+              <w:pStyle w:val="Tablebody"/>
+              <w:jc w:val="center"/>
+              <w:rPr>
+                <w:b/>
+                <w:bCs/>
+              </w:rPr>
+            </w:pPr>
+            <w:r>
+              <w:rPr>
+                <w:b/>
+                <w:bCs/>
+              </w:rPr>
+              <w:t>Requirement ID</w:t>
+            </w:r>
+          </w:p>
+        </w:tc>
+        <w:tc>
+          <w:tcPr>
+            <w:tcW w:w="2572" w:type="dxa"/>
+            <w:shd w:val="clear" w:color="auto" w:fill="F2F2F2" w:themeFill="background1" w:themeFillShade="F2"/>
+            <w:vAlign w:val="center"/>
+          </w:tcPr>
+          <w:p>
+            <w:pPr>
+              <w:pStyle w:val="Tablebody"/>
+              <w:jc w:val="center"/>
+              <w:rPr>
+                <w:b/>
+                <w:bCs/>
+              </w:rPr>
+            </w:pPr>
+            <w:r>
+              <w:rPr>
+                <w:b/>
+                <w:bCs/>
+              </w:rPr>
+              <w:t>Requirement Name</w:t>
+            </w:r>
+          </w:p>
+        </w:tc>
+        <w:tc>
+          <w:tcPr>
+            <w:tcW w:w="5751" w:type="dxa"/>
+            <w:shd w:val="clear" w:color="auto" w:fill="F2F2F2" w:themeFill="background1" w:themeFillShade="F2"/>
+            <w:vAlign w:val="center"/>
+          </w:tcPr>
+          <w:p>
+            <w:pPr>
+              <w:pStyle w:val="Tablebody"/>
+              <w:jc w:val="center"/>
+              <w:rPr>
+                <w:b/>
+                <w:bCs/>
+              </w:rPr>
+            </w:pPr>
+            <w:r>
+              <w:rPr>
+                <w:b/>
+                <w:bCs/>
+              </w:rPr>
+              <w:t>Implementation in Part 3</w:t>
+            </w:r>
+          </w:p>
+        </w:tc>
+      </w:tr>
+      <w:tr>
+        <w:trPr>
+          <w:cantSplit/>
+        </w:trPr>
+        <w:tc>
+          <w:tcPr>
+            <w:tcW w:w="1413" w:type="dxa"/>
+            <w:vAlign w:val="center"/>
+          </w:tcPr>
+          <w:p>
+            <w:pPr>
+              <w:pStyle w:val="Tablebody"/>
+            </w:pPr>
+            <w:r>
+              <w:t>GL-REQ-0001</w:t>
+            </w:r>
+          </w:p>
+        </w:tc>
+        <w:tc>
+          <w:tcPr>
+            <w:tcW w:w="2572" w:type="dxa"/>
+            <w:vAlign w:val="center"/>
+          </w:tcPr>
+          <w:p>
+            <w:pPr>
+              <w:pStyle w:val="Tablebody"/>
+            </w:pPr>
+            <w:r>
+              <w:t>Semantic layer separation</w:t>
+            </w:r>
+          </w:p>
+        </w:tc>
+        <w:tc>
+          <w:tcPr>
+            <w:tcW w:w="5751" w:type="dxa"/>
+            <w:vAlign w:val="center"/>
+          </w:tcPr>
+          <w:p>
+            <w:pPr>
+              <w:pStyle w:val="Tablebody"/>
+            </w:pPr>
+            <w:r>
+              <w:t>Uses formal HMD-for-taxonomy inputs from Part 1 and preserves their semantic paths, reviewed datatypes, multiplicities and source traceability while generating a separate OIM binding (Clauses 4–5).</w:t>
+            </w:r>
+          </w:p>
+        </w:tc>
+      </w:tr>
+      <w:tr>
+        <w:trPr>
+          <w:cantSplit/>
+        </w:trPr>
+        <w:tc>
+          <w:tcPr>
+            <w:tcW w:w="1413" w:type="dxa"/>
+            <w:vAlign w:val="center"/>
+          </w:tcPr>
+          <w:p>
+            <w:pPr>
+              <w:pStyle w:val="Tablebody"/>
+            </w:pPr>
+            <w:r>
+              <w:t>GL-REQ-0107</w:t>
+            </w:r>
+          </w:p>
+        </w:tc>
+        <w:tc>
+          <w:tcPr>
+            <w:tcW w:w="2572" w:type="dxa"/>
+            <w:vAlign w:val="center"/>
+          </w:tcPr>
+          <w:p>
+            <w:pPr>
+              <w:pStyle w:val="Tablebody"/>
+            </w:pPr>
+            <w:r>
+              <w:t>Validation and data quality hooks</w:t>
+            </w:r>
+          </w:p>
+        </w:tc>
+        <w:tc>
+          <w:tcPr>
+            <w:tcW w:w="5751" w:type="dxa"/>
+            <w:vAlign w:val="center"/>
+          </w:tcPr>
+          <w:p>
+            <w:pPr>
+              <w:pStyle w:val="Tablebody"/>
+            </w:pPr>
+            <w:r>
+              <w:t>Requires validation of authoritative HMD rows, resolved QNames, dimensional and closed-cube constraints, taxonomy entry points and xBRL-CSV report metadata and facts (Clauses 4, 8.7 and 12).</w:t>
+            </w:r>
+          </w:p>
+        </w:tc>
+      </w:tr>
+      <w:tr>
+        <w:trPr>
+          <w:cantSplit/>
+        </w:trPr>
+        <w:tc>
+          <w:tcPr>
+            <w:tcW w:w="1413" w:type="dxa"/>
+            <w:vAlign w:val="center"/>
+          </w:tcPr>
+          <w:p>
+            <w:pPr>
+              <w:pStyle w:val="Tablebody"/>
+            </w:pPr>
+            <w:r>
+              <w:t>GL-REQ-0109</w:t>
+            </w:r>
+          </w:p>
+        </w:tc>
+        <w:tc>
+          <w:tcPr>
+            <w:tcW w:w="2572" w:type="dxa"/>
+            <w:vAlign w:val="center"/>
+          </w:tcPr>
+          <w:p>
+            <w:pPr>
+              <w:pStyle w:val="Tablebody"/>
+            </w:pPr>
+            <w:r>
+              <w:t>Business transaction module root and anchoring</w:t>
+            </w:r>
+          </w:p>
+        </w:tc>
+        <w:tc>
+          <w:tcPr>
+            <w:tcW w:w="5751" w:type="dxa"/>
+            <w:vAlign w:val="center"/>
+          </w:tcPr>
+          <w:p>
+            <w:pPr>
+              <w:pStyle w:val="Tablebody"/>
+            </w:pPr>
+            <w:r>
+              <w:t>Generates independent accountingEntries and businessTransactions OIM entry points and dimensional networks, without combining their root-specific DTSs (Clauses 7.5 and 10).</w:t>
+            </w:r>
+          </w:p>
+        </w:tc>
+      </w:tr>
+      <w:tr>
+        <w:trPr>
+          <w:cantSplit/>
+        </w:trPr>
+        <w:tc>
+          <w:tcPr>
+            <w:tcW w:w="1413" w:type="dxa"/>
+            <w:vAlign w:val="center"/>
+          </w:tcPr>
+          <w:p>
+            <w:pPr>
+              <w:pStyle w:val="Tablebody"/>
+            </w:pPr>
+            <w:r>
+              <w:t>GL-REQ-0201</w:t>
+            </w:r>
+          </w:p>
+        </w:tc>
+        <w:tc>
+          <w:tcPr>
+            <w:tcW w:w="2572" w:type="dxa"/>
+            <w:vAlign w:val="center"/>
+          </w:tcPr>
+          <w:p>
+            <w:pPr>
+              <w:pStyle w:val="Tablebody"/>
+            </w:pPr>
+            <w:r>
+              <w:t>Modular taxonomy architecture</w:t>
+            </w:r>
+          </w:p>
+        </w:tc>
+        <w:tc>
+          <w:tcPr>
+            <w:tcW w:w="5751" w:type="dxa"/>
+            <w:vAlign w:val="center"/>
+          </w:tcPr>
+          <w:p>
+            <w:pPr>
+              <w:pStyle w:val="Tablebody"/>
+            </w:pPr>
+            <w:r>
+              <w:t>Defines reusable OIM module schemas, primary-item anchors, labels and presentation networks, together with separate HMD-specific hypercubes, dimensions and message entry points (Clauses 5, 7 and 11).</w:t>
+            </w:r>
+          </w:p>
+        </w:tc>
+      </w:tr>
+      <w:tr>
+        <w:trPr>
+          <w:cantSplit/>
+        </w:trPr>
+        <w:tc>
+          <w:tcPr>
+            <w:tcW w:w="1413" w:type="dxa"/>
+            <w:vAlign w:val="center"/>
+          </w:tcPr>
+          <w:p>
+            <w:pPr>
+              <w:pStyle w:val="Tablebody"/>
+            </w:pPr>
+            <w:r>
+              <w:t>GL-REQ-0207</w:t>
+            </w:r>
+          </w:p>
+        </w:tc>
+        <w:tc>
+          <w:tcPr>
+            <w:tcW w:w="2572" w:type="dxa"/>
+            <w:vAlign w:val="center"/>
+          </w:tcPr>
+          <w:p>
+            <w:pPr>
+              <w:pStyle w:val="Tablebody"/>
+            </w:pPr>
+            <w:r>
+              <w:t>Profile declaration of roots and module combinations</w:t>
+            </w:r>
+          </w:p>
+        </w:tc>
+        <w:tc>
+          <w:tcPr>
+            <w:tcW w:w="5751" w:type="dxa"/>
+            <w:vAlign w:val="center"/>
+          </w:tcPr>
+          <w:p>
+            <w:pPr>
+              <w:pStyle w:val="Tablebody"/>
+            </w:pPr>
+            <w:r>
+              <w:t>Selects the root-specific OIM DTS and required module declarations from the formal HMD, keeping each root’s own dimensional scope and taxonomy entry point (Clauses 7.5, 10 and 11).</w:t>
+            </w:r>
+          </w:p>
+        </w:tc>
+      </w:tr>
+      <w:tr>
+        <w:trPr>
+          <w:cantSplit/>
+        </w:trPr>
+        <w:tc>
+          <w:tcPr>
+            <w:tcW w:w="1413" w:type="dxa"/>
+            <w:vAlign w:val="center"/>
+          </w:tcPr>
+          <w:p>
+            <w:pPr>
+              <w:pStyle w:val="Tablebody"/>
+            </w:pPr>
+            <w:r>
+              <w:t>GL-REQ-0301</w:t>
+            </w:r>
+          </w:p>
+        </w:tc>
+        <w:tc>
+          <w:tcPr>
+            <w:tcW w:w="2572" w:type="dxa"/>
+            <w:vAlign w:val="center"/>
+          </w:tcPr>
+          <w:p>
+            <w:pPr>
+              <w:pStyle w:val="Tablebody"/>
+            </w:pPr>
+            <w:r>
+              <w:t>Support for XML and OIM</w:t>
+            </w:r>
+          </w:p>
+        </w:tc>
+        <w:tc>
+          <w:tcPr>
+            <w:tcW w:w="5751" w:type="dxa"/>
+            <w:vAlign w:val="center"/>
+          </w:tcPr>
+          <w:p>
+            <w:pPr>
+              <w:pStyle w:val="Tablebody"/>
+            </w:pPr>
+            <w:r>
+              <w:t>Provides the OIM-compatible binding of the common semantic model, with xBRL-CSV metadata and data tables distinguished from taxonomy generation (Clauses 2.1, 7–8).</w:t>
+            </w:r>
+          </w:p>
+        </w:tc>
+      </w:tr>
+      <w:tr>
+        <w:trPr>
+          <w:cantSplit/>
+        </w:trPr>
+        <w:tc>
+          <w:tcPr>
+            <w:tcW w:w="1413" w:type="dxa"/>
+            <w:vAlign w:val="center"/>
+          </w:tcPr>
+          <w:p>
+            <w:pPr>
+              <w:pStyle w:val="Tablebody"/>
+            </w:pPr>
+            <w:r>
+              <w:t>GL-REQ-0302</w:t>
+            </w:r>
+          </w:p>
+        </w:tc>
+        <w:tc>
+          <w:tcPr>
+            <w:tcW w:w="2572" w:type="dxa"/>
+            <w:vAlign w:val="center"/>
+          </w:tcPr>
+          <w:p>
+            <w:pPr>
+              <w:pStyle w:val="Tablebody"/>
+            </w:pPr>
+            <w:r>
+              <w:t>OIM capability completeness</w:t>
+            </w:r>
+          </w:p>
+        </w:tc>
+        <w:tc>
+          <w:tcPr>
+            <w:tcW w:w="5751" w:type="dxa"/>
+            <w:vAlign w:val="center"/>
+          </w:tcPr>
+          <w:p>
+            <w:pPr>
+              <w:pStyle w:val="Tablebody"/>
+            </w:pPr>
+            <w:r>
+              <w:t>Defines Attribute fact concepts, reusable Class anchors, closed hypercubes, occurrence-key typed dimensions, presentation and targetRole networks and discoverable OIM DTSs (Clauses 5–8).</w:t>
+            </w:r>
+          </w:p>
+        </w:tc>
+      </w:tr>
+      <w:tr>
+        <w:trPr>
+          <w:cantSplit/>
+        </w:trPr>
+        <w:tc>
+          <w:tcPr>
+            <w:tcW w:w="1413" w:type="dxa"/>
+            <w:vAlign w:val="center"/>
+          </w:tcPr>
+          <w:p>
+            <w:pPr>
+              <w:pStyle w:val="Tablebody"/>
+            </w:pPr>
+            <w:r>
+              <w:t>GL-REQ-0303</w:t>
+            </w:r>
+          </w:p>
+        </w:tc>
+        <w:tc>
+          <w:tcPr>
+            <w:tcW w:w="2572" w:type="dxa"/>
+            <w:vAlign w:val="center"/>
+          </w:tcPr>
+          <w:p>
+            <w:pPr>
+              <w:pStyle w:val="Tablebody"/>
+            </w:pPr>
+            <w:r>
+              <w:t>Deterministic transformability</w:t>
+            </w:r>
+          </w:p>
+        </w:tc>
+        <w:tc>
+          <w:tcPr>
+            <w:tcW w:w="5751" w:type="dxa"/>
+            <w:vAlign w:val="center"/>
+          </w:tcPr>
+          <w:p>
+            <w:pPr>
+              <w:pStyle w:val="Tablebody"/>
+            </w:pPr>
+            <w:r>
+              <w:t>Defines cross-binding equivalence by semantic_path, expanded fact QName, ancestor scope and multiplicity, rather than by requiring OIM dimensional structure to resemble XML Tuple nesting (Clause 9).</w:t>
+            </w:r>
+          </w:p>
+        </w:tc>
+      </w:tr>
+      <w:tr>
+        <w:trPr>
+          <w:cantSplit/>
+        </w:trPr>
+        <w:tc>
+          <w:tcPr>
+            <w:tcW w:w="1413" w:type="dxa"/>
+            <w:vAlign w:val="center"/>
+          </w:tcPr>
+          <w:p>
+            <w:pPr>
+              <w:pStyle w:val="Tablebody"/>
+            </w:pPr>
+            <w:r>
+              <w:t>GL-REQ-0304</w:t>
+            </w:r>
+          </w:p>
+        </w:tc>
+        <w:tc>
+          <w:tcPr>
+            <w:tcW w:w="2572" w:type="dxa"/>
+            <w:vAlign w:val="center"/>
+          </w:tcPr>
+          <w:p>
+            <w:pPr>
+              <w:pStyle w:val="Tablebody"/>
+            </w:pPr>
+            <w:r>
+              <w:t>Consistent dimensional modelling</w:t>
+            </w:r>
+          </w:p>
+        </w:tc>
+        <w:tc>
+          <w:tcPr>
+            <w:tcW w:w="5751" w:type="dxa"/>
+            <w:vAlign w:val="center"/>
+          </w:tcPr>
+          <w:p>
+            <w:pPr>
+              <w:pStyle w:val="Tablebody"/>
+            </w:pPr>
+            <w:r>
+              <w:t>Restricts typed occurrence dimensions to the root and repeating Classes, aligns them one-to-one with Structured CSV occurrence-key columns and preserves parent-scoped identity through closed cubes (Clauses 5–6 and 8.3).</w:t>
+            </w:r>
+          </w:p>
+        </w:tc>
+      </w:tr>
+      <w:tr>
+        <w:trPr>
+          <w:cantSplit/>
+        </w:trPr>
+        <w:tc>
+          <w:tcPr>
+            <w:tcW w:w="1413" w:type="dxa"/>
+            <w:vAlign w:val="center"/>
+          </w:tcPr>
+          <w:p>
+            <w:pPr>
+              <w:pStyle w:val="Tablebody"/>
+            </w:pPr>
+            <w:r>
+              <w:t>GL-REQ-0401</w:t>
+            </w:r>
+          </w:p>
+        </w:tc>
+        <w:tc>
+          <w:tcPr>
+            <w:tcW w:w="2572" w:type="dxa"/>
+            <w:vAlign w:val="center"/>
+          </w:tcPr>
+          <w:p>
+            <w:pPr>
+              <w:pStyle w:val="Tablebody"/>
+            </w:pPr>
+            <w:r>
+              <w:t>Tooling and sample data</w:t>
+            </w:r>
+          </w:p>
+        </w:tc>
+        <w:tc>
+          <w:tcPr>
+            <w:tcW w:w="5751" w:type="dxa"/>
+            <w:vAlign w:val="center"/>
+          </w:tcPr>
+          <w:p>
+            <w:pPr>
+              <w:pStyle w:val="Tablebody"/>
+            </w:pPr>
+            <w:r>
+              <w:t>Includes Accounting Entries and Business Transactions xBRL-CSV JSON/CSV examples and specifies taxonomy and report-validation checks for their entry points and dimensional constraints (Clauses 12 and 14).</w:t>
+            </w:r>
+          </w:p>
+        </w:tc>
+      </w:tr>
+      <w:tr>
+        <w:trPr>
+          <w:cantSplit/>
+        </w:trPr>
+        <w:tc>
+          <w:tcPr>
+            <w:tcW w:w="1413" w:type="dxa"/>
+            <w:vAlign w:val="center"/>
+          </w:tcPr>
+          <w:p>
+            <w:pPr>
+              <w:pStyle w:val="Tablebody"/>
+            </w:pPr>
+            <w:r>
+              <w:t>GL-REQ-0403</w:t>
+            </w:r>
+          </w:p>
+        </w:tc>
+        <w:tc>
+          <w:tcPr>
+            <w:tcW w:w="2572" w:type="dxa"/>
+            <w:vAlign w:val="center"/>
+          </w:tcPr>
+          <w:p>
+            <w:pPr>
+              <w:pStyle w:val="Tablebody"/>
+            </w:pPr>
+            <w:r>
+              <w:t>Interoperability evidence and pilot criteria</w:t>
+            </w:r>
+          </w:p>
+        </w:tc>
+        <w:tc>
+          <w:tcPr>
+            <w:tcW w:w="5751" w:type="dxa"/>
+            <w:vAlign w:val="center"/>
+          </w:tcPr>
+          <w:p>
+            <w:pPr>
+              <w:pStyle w:val="Tablebody"/>
+            </w:pPr>
+            <w:r>
+              <w:t>Specifies evidence of deterministic OIM generation, full DTS discovery, closed-cube consistency, dimension-column alignment and report validation through independent HMD roots (Clause 12).</w:t>
+            </w:r>
+          </w:p>
+        </w:tc>
+      </w:tr>
+      <w:tr>
+        <w:trPr>
+          <w:cantSplit/>
+        </w:trPr>
+        <w:tc>
+          <w:tcPr>
+            <w:tcW w:w="1413" w:type="dxa"/>
+            <w:vAlign w:val="center"/>
+          </w:tcPr>
+          <w:p>
+            <w:pPr>
+              <w:pStyle w:val="Tablebody"/>
+            </w:pPr>
+            <w:r>
+              <w:t>GL-REQ-0501</w:t>
+            </w:r>
+          </w:p>
+        </w:tc>
+        <w:tc>
+          <w:tcPr>
+            <w:tcW w:w="2572" w:type="dxa"/>
+            <w:vAlign w:val="center"/>
+          </w:tcPr>
+          <w:p>
+            <w:pPr>
+              <w:pStyle w:val="Tablebody"/>
+            </w:pPr>
+            <w:r>
+              <w:t>Extensible code lists</w:t>
+            </w:r>
+          </w:p>
+        </w:tc>
+        <w:tc>
+          <w:tcPr>
+            <w:tcW w:w="5751" w:type="dxa"/>
+            <w:vAlign w:val="center"/>
+          </w:tcPr>
+          <w:p>
+            <w:pPr>
+              <w:pStyle w:val="Tablebody"/>
+            </w:pPr>
+            <w:r>
+              <w:t xml:space="preserve">Defines deterministic EE1 </w:t>
+            </w:r>
+            <w:proofErr w:type="spellStart"/>
+            <w:r>
+              <w:t>realisation</w:t>
+            </w:r>
+            <w:proofErr w:type="spellEnd"/>
+            <w:r>
+              <w:t xml:space="preserve"> of reviewed Value Domain assignments as one permitted member for each scalar fact, separate from occurrence dimensions (Clauses 8.8–8.9).</w:t>
+            </w:r>
+          </w:p>
+        </w:tc>
+      </w:tr>
+      <w:tr>
+        <w:trPr>
+          <w:cantSplit/>
+        </w:trPr>
+        <w:tc>
+          <w:tcPr>
+            <w:tcW w:w="1413" w:type="dxa"/>
+            <w:vAlign w:val="center"/>
+          </w:tcPr>
+          <w:p>
+            <w:pPr>
+              <w:pStyle w:val="Tablebody"/>
+            </w:pPr>
+            <w:r>
+              <w:t>GL-REQ-0502</w:t>
+            </w:r>
+          </w:p>
+        </w:tc>
+        <w:tc>
+          <w:tcPr>
+            <w:tcW w:w="2572" w:type="dxa"/>
+            <w:vAlign w:val="center"/>
+          </w:tcPr>
+          <w:p>
+            <w:pPr>
+              <w:pStyle w:val="Tablebody"/>
+            </w:pPr>
+            <w:r>
+              <w:t>Alignment with external code lists</w:t>
+            </w:r>
+          </w:p>
+        </w:tc>
+        <w:tc>
+          <w:tcPr>
+            <w:tcW w:w="5751" w:type="dxa"/>
+            <w:vAlign w:val="center"/>
+          </w:tcPr>
+          <w:p>
+            <w:pPr>
+              <w:pStyle w:val="Tablebody"/>
+            </w:pPr>
+            <w:r>
+              <w:t>Preserves governed legacy, standard and user-defined Value Domain identities and keeps external provenance, vocabulary versions, rights and crosswalk operations separate from report cells (Clause 8.8).</w:t>
+            </w:r>
+          </w:p>
+        </w:tc>
+      </w:tr>
+    </w:tbl>
     <w:p/>
     <w:sectPr>
       <w:headerReference w:type="even" r:id="rId17"/>
@@ -30416,6 +31261,119 @@
     </w:lvl>
   </w:abstractNum>
   <w:abstractNum w:abstractNumId="46" w15:restartNumberingAfterBreak="0">
+    <w:nsid w:val="712B4E67"/>
+    <w:multiLevelType w:val="hybridMultilevel"/>
+    <w:tmpl w:val="315E35E0"/>
+    <w:lvl w:ilvl="0" w:tplc="08090001">
+      <w:start w:val="1"/>
+      <w:numFmt w:val="bullet"/>
+      <w:lvlText w:val=""/>
+      <w:lvlJc w:val="left"/>
+      <w:pPr>
+        <w:ind w:left="440" w:hanging="440"/>
+      </w:pPr>
+      <w:rPr>
+        <w:rFonts w:ascii="Symbol" w:hAnsi="Symbol" w:hint="default"/>
+      </w:rPr>
+    </w:lvl>
+    <w:lvl w:ilvl="1" w:tplc="0409000B" w:tentative="1">
+      <w:start w:val="1"/>
+      <w:numFmt w:val="bullet"/>
+      <w:lvlText w:val=""/>
+      <w:lvlJc w:val="left"/>
+      <w:pPr>
+        <w:ind w:left="880" w:hanging="440"/>
+      </w:pPr>
+      <w:rPr>
+        <w:rFonts w:ascii="Wingdings" w:hAnsi="Wingdings" w:hint="default"/>
+      </w:rPr>
+    </w:lvl>
+    <w:lvl w:ilvl="2" w:tplc="0409000D" w:tentative="1">
+      <w:start w:val="1"/>
+      <w:numFmt w:val="bullet"/>
+      <w:lvlText w:val=""/>
+      <w:lvlJc w:val="left"/>
+      <w:pPr>
+        <w:ind w:left="1320" w:hanging="440"/>
+      </w:pPr>
+      <w:rPr>
+        <w:rFonts w:ascii="Wingdings" w:hAnsi="Wingdings" w:hint="default"/>
+      </w:rPr>
+    </w:lvl>
+    <w:lvl w:ilvl="3" w:tplc="04090001" w:tentative="1">
+      <w:start w:val="1"/>
+      <w:numFmt w:val="bullet"/>
+      <w:lvlText w:val=""/>
+      <w:lvlJc w:val="left"/>
+      <w:pPr>
+        <w:ind w:left="1760" w:hanging="440"/>
+      </w:pPr>
+      <w:rPr>
+        <w:rFonts w:ascii="Wingdings" w:hAnsi="Wingdings" w:hint="default"/>
+      </w:rPr>
+    </w:lvl>
+    <w:lvl w:ilvl="4" w:tplc="0409000B" w:tentative="1">
+      <w:start w:val="1"/>
+      <w:numFmt w:val="bullet"/>
+      <w:lvlText w:val=""/>
+      <w:lvlJc w:val="left"/>
+      <w:pPr>
+        <w:ind w:left="2200" w:hanging="440"/>
+      </w:pPr>
+      <w:rPr>
+        <w:rFonts w:ascii="Wingdings" w:hAnsi="Wingdings" w:hint="default"/>
+      </w:rPr>
+    </w:lvl>
+    <w:lvl w:ilvl="5" w:tplc="0409000D" w:tentative="1">
+      <w:start w:val="1"/>
+      <w:numFmt w:val="bullet"/>
+      <w:lvlText w:val=""/>
+      <w:lvlJc w:val="left"/>
+      <w:pPr>
+        <w:ind w:left="2640" w:hanging="440"/>
+      </w:pPr>
+      <w:rPr>
+        <w:rFonts w:ascii="Wingdings" w:hAnsi="Wingdings" w:hint="default"/>
+      </w:rPr>
+    </w:lvl>
+    <w:lvl w:ilvl="6" w:tplc="04090001" w:tentative="1">
+      <w:start w:val="1"/>
+      <w:numFmt w:val="bullet"/>
+      <w:lvlText w:val=""/>
+      <w:lvlJc w:val="left"/>
+      <w:pPr>
+        <w:ind w:left="3080" w:hanging="440"/>
+      </w:pPr>
+      <w:rPr>
+        <w:rFonts w:ascii="Wingdings" w:hAnsi="Wingdings" w:hint="default"/>
+      </w:rPr>
+    </w:lvl>
+    <w:lvl w:ilvl="7" w:tplc="0409000B" w:tentative="1">
+      <w:start w:val="1"/>
+      <w:numFmt w:val="bullet"/>
+      <w:lvlText w:val=""/>
+      <w:lvlJc w:val="left"/>
+      <w:pPr>
+        <w:ind w:left="3520" w:hanging="440"/>
+      </w:pPr>
+      <w:rPr>
+        <w:rFonts w:ascii="Wingdings" w:hAnsi="Wingdings" w:hint="default"/>
+      </w:rPr>
+    </w:lvl>
+    <w:lvl w:ilvl="8" w:tplc="0409000D" w:tentative="1">
+      <w:start w:val="1"/>
+      <w:numFmt w:val="bullet"/>
+      <w:lvlText w:val=""/>
+      <w:lvlJc w:val="left"/>
+      <w:pPr>
+        <w:ind w:left="3960" w:hanging="440"/>
+      </w:pPr>
+      <w:rPr>
+        <w:rFonts w:ascii="Wingdings" w:hAnsi="Wingdings" w:hint="default"/>
+      </w:rPr>
+    </w:lvl>
+  </w:abstractNum>
+  <w:abstractNum w:abstractNumId="47" w15:restartNumberingAfterBreak="0">
     <w:nsid w:val="761B4164"/>
     <w:multiLevelType w:val="hybridMultilevel"/>
     <w:tmpl w:val="BA2264AC"/>
@@ -30527,7 +31485,7 @@
       </w:rPr>
     </w:lvl>
   </w:abstractNum>
-  <w:abstractNum w:abstractNumId="47" w15:restartNumberingAfterBreak="0">
+  <w:abstractNum w:abstractNumId="48" w15:restartNumberingAfterBreak="0">
     <w:nsid w:val="7E7B1635"/>
     <w:multiLevelType w:val="hybridMultilevel"/>
     <w:tmpl w:val="44805086"/>
@@ -30616,7 +31574,7 @@
       </w:pPr>
     </w:lvl>
   </w:abstractNum>
-  <w:abstractNum w:abstractNumId="48" w15:restartNumberingAfterBreak="0">
+  <w:abstractNum w:abstractNumId="49" w15:restartNumberingAfterBreak="0">
     <w:nsid w:val="7EC93298"/>
     <w:multiLevelType w:val="hybridMultilevel"/>
     <w:tmpl w:val="E4D8C82E"/>
@@ -30717,7 +31675,7 @@
     <w:abstractNumId w:val="0"/>
   </w:num>
   <w:num w:numId="4" w16cid:durableId="1544753654">
-    <w:abstractNumId w:val="46"/>
+    <w:abstractNumId w:val="47"/>
   </w:num>
   <w:num w:numId="5" w16cid:durableId="348411247">
     <w:abstractNumId w:val="5"/>
@@ -30732,7 +31690,7 @@
     <w:abstractNumId w:val="35"/>
   </w:num>
   <w:num w:numId="9" w16cid:durableId="1726374959">
-    <w:abstractNumId w:val="48"/>
+    <w:abstractNumId w:val="49"/>
   </w:num>
   <w:num w:numId="10" w16cid:durableId="1130635520">
     <w:abstractNumId w:val="18"/>
@@ -30798,7 +31756,7 @@
     <w:abstractNumId w:val="14"/>
   </w:num>
   <w:num w:numId="31" w16cid:durableId="81798255">
-    <w:abstractNumId w:val="47"/>
+    <w:abstractNumId w:val="48"/>
   </w:num>
   <w:num w:numId="32" w16cid:durableId="49614401">
     <w:abstractNumId w:val="10"/>
@@ -30853,6 +31811,9 @@
   </w:num>
   <w:num w:numId="49" w16cid:durableId="3629019">
     <w:abstractNumId w:val="1"/>
+  </w:num>
+  <w:num w:numId="50" w16cid:durableId="747774920">
+    <w:abstractNumId w:val="46"/>
   </w:num>
   <w:numIdMacAtCleanup w:val="41"/>
 </w:numbering>
@@ -32437,17 +33398,16 @@
   <w:style w:type="paragraph" w:customStyle="1" w:styleId="Tablebody">
     <w:name w:val="Table body"/>
     <w:basedOn w:val="a1"/>
-    <w:rsid w:val="00FF1A3D"/>
+    <w:rsid w:val="00B67D1B"/>
     <w:pPr>
       <w:tabs>
         <w:tab w:val="left" w:pos="403"/>
       </w:tabs>
       <w:spacing w:before="60" w:after="60" w:line="240" w:lineRule="atLeast"/>
-      <w:jc w:val="center"/>
     </w:pPr>
     <w:rPr>
       <w:sz w:val="20"/>
-      <w:lang w:eastAsia="en-US"/>
+      <w:lang w:val="en-US" w:eastAsia="en-US"/>
     </w:rPr>
   </w:style>
   <w:style w:type="character" w:styleId="afc">

</xml_diff>